<commit_message>
adding updated TDD draft including our names
</commit_message>
<xml_diff>
--- a/Module-1/BlueGroup_CSD460_TDD-Mod1_2.docx
+++ b/Module-1/BlueGroup_CSD460_TDD-Mod1_2.docx
@@ -12,22 +12,21 @@
       </w:pPr>
       <w:r>
         <w:rPr>
-          <w:rFonts w:ascii="Arial" w:hAnsi="Arial" w:cs="Arial"/>
           <w:noProof/>
         </w:rPr>
         <w:drawing>
-          <wp:anchor distT="0" distB="0" distL="114300" distR="114300" simplePos="0" relativeHeight="251658240" behindDoc="0" locked="0" layoutInCell="1" allowOverlap="1" wp14:anchorId="74554B5D" wp14:editId="7BAFCF0A">
+          <wp:anchor distT="0" distB="0" distL="114300" distR="114300" simplePos="0" relativeHeight="251659264" behindDoc="0" locked="0" layoutInCell="1" allowOverlap="1" wp14:anchorId="34AEF419" wp14:editId="51B4BA42">
             <wp:simplePos x="0" y="0"/>
             <wp:positionH relativeFrom="page">
-              <wp:posOffset>0</wp:posOffset>
+              <wp:posOffset>7620</wp:posOffset>
             </wp:positionH>
             <wp:positionV relativeFrom="page">
-              <wp:posOffset>0</wp:posOffset>
+              <wp:posOffset>15240</wp:posOffset>
             </wp:positionV>
             <wp:extent cx="7772400" cy="2331720"/>
-            <wp:effectExtent l="0" t="0" r="6350" b="0"/>
+            <wp:effectExtent l="0" t="0" r="0" b="0"/>
             <wp:wrapTopAndBottom/>
-            <wp:docPr id="922262291" name="Drawing 0" descr="1a0340d2b-6abe-45f1-a6e1-310a180743e2.png"/>
+            <wp:docPr id="1513724553" name="Drawing 0" descr="183503720-e17d-4a18-b062-54610075e780.png"/>
             <wp:cNvGraphicFramePr>
               <a:graphicFrameLocks xmlns:a="http://schemas.openxmlformats.org/drawingml/2006/main" noChangeAspect="1"/>
             </wp:cNvGraphicFramePr>
@@ -35,7 +34,7 @@
               <a:graphicData uri="http://schemas.openxmlformats.org/drawingml/2006/picture">
                 <pic:pic xmlns:pic="http://schemas.openxmlformats.org/drawingml/2006/picture">
                   <pic:nvPicPr>
-                    <pic:cNvPr id="0" name="Picture 0" descr="1a0340d2b-6abe-45f1-a6e1-310a180743e2.png"/>
+                    <pic:cNvPr id="0" name="Picture 0" descr="183503720-e17d-4a18-b062-54610075e780.png"/>
                     <pic:cNvPicPr>
                       <a:picLocks noChangeAspect="1"/>
                     </pic:cNvPicPr>
@@ -58,9 +57,6 @@
                 </pic:pic>
               </a:graphicData>
             </a:graphic>
-            <wp14:sizeRelH relativeFrom="margin">
-              <wp14:pctWidth>0</wp14:pctWidth>
-            </wp14:sizeRelH>
           </wp:anchor>
         </w:drawing>
       </w:r>
@@ -186,16 +182,7 @@
           <w:sz w:val="22"/>
           <w:szCs w:val="22"/>
         </w:rPr>
-        <w:t xml:space="preserve"> utilize the online booking system, the website itself should be viewable to any visitors regardless of customer account creation. Additionally, the reservation system will not process payments for customers and will not require payment to confirm a reservation.</w:t>
-      </w:r>
-      <w:r>
-        <w:rPr>
-          <w:rFonts w:ascii="Arial" w:eastAsia="Arial" w:hAnsi="Arial" w:cs="Arial"/>
-          <w:color w:val="000000"/>
-          <w:sz w:val="22"/>
-          <w:szCs w:val="22"/>
-        </w:rPr>
-        <w:t xml:space="preserve"> </w:t>
+        <w:t xml:space="preserve"> utilize the online booking system, the website itself should be viewable to any visitors regardless of customer account creation. Additionally, the reservation system will not process payments for customers and will not require payment to confirm a reservation. </w:t>
       </w:r>
     </w:p>
     <w:p>
@@ -762,16 +749,28 @@
           <w:sz w:val="22"/>
           <w:szCs w:val="22"/>
         </w:rPr>
-        <w:t>(MDN contributors, 2025</w:t>
-      </w:r>
+        <w:t>(MDN contributors, 2025c)</w:t>
+      </w:r>
+    </w:p>
+    <w:p>
+      <w:pPr>
+        <w:spacing w:before="60" w:after="60" w:line="480" w:lineRule="auto"/>
+        <w:jc w:val="both"/>
+        <w:rPr>
+          <w:rFonts w:ascii="Arial" w:hAnsi="Arial" w:cs="Arial"/>
+          <w:sz w:val="22"/>
+          <w:szCs w:val="22"/>
+        </w:rPr>
+      </w:pPr>
       <w:r>
         <w:rPr>
           <w:rFonts w:ascii="Arial" w:eastAsia="Arial" w:hAnsi="Arial" w:cs="Arial"/>
           <w:color w:val="000000"/>
           <w:sz w:val="22"/>
           <w:szCs w:val="22"/>
-        </w:rPr>
-        <w:t>c</w:t>
+          <w:u w:val="single" w:color="000000"/>
+        </w:rPr>
+        <w:t>Database</w:t>
       </w:r>
       <w:r>
         <w:rPr>
@@ -780,7 +779,16 @@
           <w:sz w:val="22"/>
           <w:szCs w:val="22"/>
         </w:rPr>
-        <w:t>)</w:t>
+        <w:t xml:space="preserve"> - a system that collects and stores organized data. Databases make searching and structuring information easier and more efficient. </w:t>
+      </w:r>
+      <w:r>
+        <w:rPr>
+          <w:rFonts w:ascii="Arial" w:eastAsia="Arial" w:hAnsi="Arial" w:cs="Arial"/>
+          <w:color w:val="000000"/>
+          <w:sz w:val="22"/>
+          <w:szCs w:val="22"/>
+        </w:rPr>
+        <w:t>(Erickson, 2024)</w:t>
       </w:r>
     </w:p>
     <w:p>
@@ -801,7 +809,7 @@
           <w:szCs w:val="22"/>
           <w:u w:val="single" w:color="000000"/>
         </w:rPr>
-        <w:t>Database</w:t>
+        <w:t>Open Source</w:t>
       </w:r>
       <w:r>
         <w:rPr>
@@ -810,14 +818,44 @@
           <w:sz w:val="22"/>
           <w:szCs w:val="22"/>
         </w:rPr>
-        <w:t xml:space="preserve"> - a system that collects and stores organized data. Databases make searching and structuring information easier and more efficient. </w:t>
-      </w:r>
+        <w:t xml:space="preserve"> - publicly available code/designs </w:t>
+      </w:r>
+    </w:p>
+    <w:p>
+      <w:pPr>
+        <w:spacing w:before="60" w:after="60" w:line="480" w:lineRule="auto"/>
+        <w:jc w:val="both"/>
+        <w:rPr>
+          <w:rFonts w:ascii="Arial" w:hAnsi="Arial" w:cs="Arial"/>
+          <w:sz w:val="22"/>
+          <w:szCs w:val="22"/>
+        </w:rPr>
+      </w:pPr>
       <w:r>
         <w:rPr>
           <w:rFonts w:ascii="Arial" w:eastAsia="Arial" w:hAnsi="Arial" w:cs="Arial"/>
           <w:color w:val="000000"/>
           <w:sz w:val="22"/>
           <w:szCs w:val="22"/>
+          <w:u w:val="single" w:color="000000"/>
+        </w:rPr>
+        <w:t>RDBMS</w:t>
+      </w:r>
+      <w:r>
+        <w:rPr>
+          <w:rFonts w:ascii="Arial" w:eastAsia="Arial" w:hAnsi="Arial" w:cs="Arial"/>
+          <w:color w:val="000000"/>
+          <w:sz w:val="22"/>
+          <w:szCs w:val="22"/>
+        </w:rPr>
+        <w:t xml:space="preserve"> - stands for Relational Database Management System </w:t>
+      </w:r>
+      <w:r>
+        <w:rPr>
+          <w:rFonts w:ascii="Arial" w:eastAsia="Arial" w:hAnsi="Arial" w:cs="Arial"/>
+          <w:color w:val="000000"/>
+          <w:sz w:val="22"/>
+          <w:szCs w:val="22"/>
         </w:rPr>
         <w:t>(Erickson, 2024)</w:t>
       </w:r>
@@ -840,7 +878,7 @@
           <w:szCs w:val="22"/>
           <w:u w:val="single" w:color="000000"/>
         </w:rPr>
-        <w:t>Open Source</w:t>
+        <w:t>MySQL</w:t>
       </w:r>
       <w:r>
         <w:rPr>
@@ -849,7 +887,16 @@
           <w:sz w:val="22"/>
           <w:szCs w:val="22"/>
         </w:rPr>
-        <w:t xml:space="preserve"> - publicly available code/designs </w:t>
+        <w:t xml:space="preserve"> - an open-source RDBMS that is commonly used to manage databases for companies </w:t>
+      </w:r>
+      <w:r>
+        <w:rPr>
+          <w:rFonts w:ascii="Arial" w:eastAsia="Arial" w:hAnsi="Arial" w:cs="Arial"/>
+          <w:color w:val="000000"/>
+          <w:sz w:val="22"/>
+          <w:szCs w:val="22"/>
+        </w:rPr>
+        <w:t>(Erickson, 2024)</w:t>
       </w:r>
     </w:p>
     <w:p>
@@ -870,7 +917,7 @@
           <w:szCs w:val="22"/>
           <w:u w:val="single" w:color="000000"/>
         </w:rPr>
-        <w:t>RDBMS</w:t>
+        <w:t>Regular Expression (Regex)</w:t>
       </w:r>
       <w:r>
         <w:rPr>
@@ -879,16 +926,37 @@
           <w:sz w:val="22"/>
           <w:szCs w:val="22"/>
         </w:rPr>
-        <w:t xml:space="preserve"> - stands for Relational Database Management System </w:t>
-      </w:r>
+        <w:t xml:space="preserve"> - a pattern-matching mechanism that can be used to check whether text conforms to a specific format. For example, a phone number is 10 digits and is typically formatted XXX-XXX-XXXX </w:t>
+      </w:r>
+    </w:p>
+    <w:p>
+      <w:pPr>
+        <w:spacing w:before="60" w:after="60" w:line="480" w:lineRule="auto"/>
+        <w:jc w:val="both"/>
+        <w:rPr>
+          <w:rFonts w:ascii="Arial" w:hAnsi="Arial" w:cs="Arial"/>
+          <w:sz w:val="22"/>
+          <w:szCs w:val="22"/>
+        </w:rPr>
+      </w:pPr>
       <w:r>
         <w:rPr>
           <w:rFonts w:ascii="Arial" w:eastAsia="Arial" w:hAnsi="Arial" w:cs="Arial"/>
           <w:color w:val="000000"/>
           <w:sz w:val="22"/>
           <w:szCs w:val="22"/>
-        </w:rPr>
-        <w:t>(Erickson, 2024)</w:t>
+          <w:u w:val="single" w:color="000000"/>
+        </w:rPr>
+        <w:t>ERD</w:t>
+      </w:r>
+      <w:r>
+        <w:rPr>
+          <w:rFonts w:ascii="Arial" w:eastAsia="Arial" w:hAnsi="Arial" w:cs="Arial"/>
+          <w:color w:val="000000"/>
+          <w:sz w:val="22"/>
+          <w:szCs w:val="22"/>
+        </w:rPr>
+        <w:t xml:space="preserve"> - stands for "Entity-Relationship Diagram"; this is a visual flowchart typically used in database design that illustrates how entities (ex. Customers, slip reservations) are related within a system </w:t>
       </w:r>
     </w:p>
     <w:p>
@@ -909,7 +977,7 @@
           <w:szCs w:val="22"/>
           <w:u w:val="single" w:color="000000"/>
         </w:rPr>
-        <w:t>MySQL</w:t>
+        <w:t>HTML</w:t>
       </w:r>
       <w:r>
         <w:rPr>
@@ -918,8 +986,9 @@
           <w:sz w:val="22"/>
           <w:szCs w:val="22"/>
         </w:rPr>
-        <w:t xml:space="preserve"> - an open-source RDBMS that is commonly used to manage databases for companies </w:t>
-      </w:r>
+        <w:t xml:space="preserve"> - stands for "</w:t>
+      </w:r>
+      <w:proofErr w:type="spellStart"/>
       <w:r>
         <w:rPr>
           <w:rFonts w:ascii="Arial" w:eastAsia="Arial" w:hAnsi="Arial" w:cs="Arial"/>
@@ -927,7 +996,26 @@
           <w:sz w:val="22"/>
           <w:szCs w:val="22"/>
         </w:rPr>
-        <w:t>(Erickson, 2024)</w:t>
+        <w:t>HyperText</w:t>
+      </w:r>
+      <w:proofErr w:type="spellEnd"/>
+      <w:r>
+        <w:rPr>
+          <w:rFonts w:ascii="Arial" w:eastAsia="Arial" w:hAnsi="Arial" w:cs="Arial"/>
+          <w:color w:val="000000"/>
+          <w:sz w:val="22"/>
+          <w:szCs w:val="22"/>
+        </w:rPr>
+        <w:t xml:space="preserve"> Markup Language"; this is the standard language that is used to create website content </w:t>
+      </w:r>
+      <w:r>
+        <w:rPr>
+          <w:rFonts w:ascii="Arial" w:eastAsia="Arial" w:hAnsi="Arial" w:cs="Arial"/>
+          <w:color w:val="000000"/>
+          <w:sz w:val="22"/>
+          <w:szCs w:val="22"/>
+        </w:rPr>
+        <w:t>(MDN contributors, 2025c)</w:t>
       </w:r>
     </w:p>
     <w:p>
@@ -948,7 +1036,7 @@
           <w:szCs w:val="22"/>
           <w:u w:val="single" w:color="000000"/>
         </w:rPr>
-        <w:t>Regular Expression (Regex)</w:t>
+        <w:t>CSS</w:t>
       </w:r>
       <w:r>
         <w:rPr>
@@ -957,7 +1045,16 @@
           <w:sz w:val="22"/>
           <w:szCs w:val="22"/>
         </w:rPr>
-        <w:t xml:space="preserve"> - a pattern-matching mechanism that can be used to check whether text conforms to a specific format. For example, a phone number is 10 digits and is typically formatted XXX-XXX-XXXX </w:t>
+        <w:t xml:space="preserve"> - stands for "Cascading Style Sheets"; used for the visual organization of HTML </w:t>
+      </w:r>
+      <w:r>
+        <w:rPr>
+          <w:rFonts w:ascii="Arial" w:eastAsia="Arial" w:hAnsi="Arial" w:cs="Arial"/>
+          <w:color w:val="000000"/>
+          <w:sz w:val="22"/>
+          <w:szCs w:val="22"/>
+        </w:rPr>
+        <w:t>(MDN contributors, 2025c)</w:t>
       </w:r>
     </w:p>
     <w:p>
@@ -978,7 +1075,7 @@
           <w:szCs w:val="22"/>
           <w:u w:val="single" w:color="000000"/>
         </w:rPr>
-        <w:t>ERD</w:t>
+        <w:t>JSP</w:t>
       </w:r>
       <w:r>
         <w:rPr>
@@ -987,29 +1084,19 @@
           <w:sz w:val="22"/>
           <w:szCs w:val="22"/>
         </w:rPr>
-        <w:t xml:space="preserve"> - stands for "Entity-Relationship Diagram"; this is a visual flowchart typically used in database design that illustrates how entities (ex. Customers, slip reservations) are related within a system </w:t>
-      </w:r>
-    </w:p>
-    <w:p>
-      <w:pPr>
-        <w:spacing w:before="60" w:after="60" w:line="480" w:lineRule="auto"/>
-        <w:jc w:val="both"/>
-        <w:rPr>
-          <w:rFonts w:ascii="Arial" w:hAnsi="Arial" w:cs="Arial"/>
-          <w:sz w:val="22"/>
-          <w:szCs w:val="22"/>
-        </w:rPr>
-      </w:pPr>
+        <w:t xml:space="preserve"> - stands for "</w:t>
+      </w:r>
+      <w:proofErr w:type="spellStart"/>
       <w:r>
         <w:rPr>
           <w:rFonts w:ascii="Arial" w:eastAsia="Arial" w:hAnsi="Arial" w:cs="Arial"/>
           <w:color w:val="000000"/>
           <w:sz w:val="22"/>
           <w:szCs w:val="22"/>
-          <w:u w:val="single" w:color="000000"/>
-        </w:rPr>
-        <w:t>HTML</w:t>
-      </w:r>
+        </w:rPr>
+        <w:t>JavaServer</w:t>
+      </w:r>
+      <w:proofErr w:type="spellEnd"/>
       <w:r>
         <w:rPr>
           <w:rFonts w:ascii="Arial" w:eastAsia="Arial" w:hAnsi="Arial" w:cs="Arial"/>
@@ -1017,9 +1104,8 @@
           <w:sz w:val="22"/>
           <w:szCs w:val="22"/>
         </w:rPr>
-        <w:t xml:space="preserve"> - stands for "</w:t>
-      </w:r>
-      <w:proofErr w:type="spellStart"/>
+        <w:t xml:space="preserve"> Pages"; a technology that is used to create web pages that can display changing information</w:t>
+      </w:r>
       <w:r>
         <w:rPr>
           <w:rFonts w:ascii="Arial" w:eastAsia="Arial" w:hAnsi="Arial" w:cs="Arial"/>
@@ -1027,9 +1113,8 @@
           <w:sz w:val="22"/>
           <w:szCs w:val="22"/>
         </w:rPr>
-        <w:t>HyperText</w:t>
-      </w:r>
-      <w:proofErr w:type="spellEnd"/>
+        <w:t xml:space="preserve"> (dynamic)</w:t>
+      </w:r>
       <w:r>
         <w:rPr>
           <w:rFonts w:ascii="Arial" w:eastAsia="Arial" w:hAnsi="Arial" w:cs="Arial"/>
@@ -1037,132 +1122,7 @@
           <w:sz w:val="22"/>
           <w:szCs w:val="22"/>
         </w:rPr>
-        <w:t xml:space="preserve"> Markup Language"; this is the standard language that is used to create website content </w:t>
-      </w:r>
-      <w:r>
-        <w:rPr>
-          <w:rFonts w:ascii="Arial" w:eastAsia="Arial" w:hAnsi="Arial" w:cs="Arial"/>
-          <w:color w:val="000000"/>
-          <w:sz w:val="22"/>
-          <w:szCs w:val="22"/>
-        </w:rPr>
-        <w:t>(MDN contributors, 2025c)</w:t>
-      </w:r>
-    </w:p>
-    <w:p>
-      <w:pPr>
-        <w:spacing w:before="60" w:after="60" w:line="480" w:lineRule="auto"/>
-        <w:jc w:val="both"/>
-        <w:rPr>
-          <w:rFonts w:ascii="Arial" w:hAnsi="Arial" w:cs="Arial"/>
-          <w:sz w:val="22"/>
-          <w:szCs w:val="22"/>
-        </w:rPr>
-      </w:pPr>
-      <w:r>
-        <w:rPr>
-          <w:rFonts w:ascii="Arial" w:eastAsia="Arial" w:hAnsi="Arial" w:cs="Arial"/>
-          <w:color w:val="000000"/>
-          <w:sz w:val="22"/>
-          <w:szCs w:val="22"/>
-          <w:u w:val="single" w:color="000000"/>
-        </w:rPr>
-        <w:t>CSS</w:t>
-      </w:r>
-      <w:r>
-        <w:rPr>
-          <w:rFonts w:ascii="Arial" w:eastAsia="Arial" w:hAnsi="Arial" w:cs="Arial"/>
-          <w:color w:val="000000"/>
-          <w:sz w:val="22"/>
-          <w:szCs w:val="22"/>
-        </w:rPr>
-        <w:t xml:space="preserve"> - stands for "Cascading Style Sheets"; used for the visual organization of HTML </w:t>
-      </w:r>
-      <w:r>
-        <w:rPr>
-          <w:rFonts w:ascii="Arial" w:eastAsia="Arial" w:hAnsi="Arial" w:cs="Arial"/>
-          <w:color w:val="000000"/>
-          <w:sz w:val="22"/>
-          <w:szCs w:val="22"/>
-        </w:rPr>
-        <w:t>(MDN contributors, 2025c)</w:t>
-      </w:r>
-    </w:p>
-    <w:p>
-      <w:pPr>
-        <w:spacing w:before="60" w:after="60" w:line="480" w:lineRule="auto"/>
-        <w:jc w:val="both"/>
-        <w:rPr>
-          <w:rFonts w:ascii="Arial" w:hAnsi="Arial" w:cs="Arial"/>
-          <w:sz w:val="22"/>
-          <w:szCs w:val="22"/>
-        </w:rPr>
-      </w:pPr>
-      <w:r>
-        <w:rPr>
-          <w:rFonts w:ascii="Arial" w:eastAsia="Arial" w:hAnsi="Arial" w:cs="Arial"/>
-          <w:color w:val="000000"/>
-          <w:sz w:val="22"/>
-          <w:szCs w:val="22"/>
-          <w:u w:val="single" w:color="000000"/>
-        </w:rPr>
-        <w:t>JSP</w:t>
-      </w:r>
-      <w:r>
-        <w:rPr>
-          <w:rFonts w:ascii="Arial" w:eastAsia="Arial" w:hAnsi="Arial" w:cs="Arial"/>
-          <w:color w:val="000000"/>
-          <w:sz w:val="22"/>
-          <w:szCs w:val="22"/>
-        </w:rPr>
-        <w:t xml:space="preserve"> - stands for "</w:t>
-      </w:r>
-      <w:proofErr w:type="spellStart"/>
-      <w:r>
-        <w:rPr>
-          <w:rFonts w:ascii="Arial" w:eastAsia="Arial" w:hAnsi="Arial" w:cs="Arial"/>
-          <w:color w:val="000000"/>
-          <w:sz w:val="22"/>
-          <w:szCs w:val="22"/>
-        </w:rPr>
-        <w:t>JavaServer</w:t>
-      </w:r>
-      <w:proofErr w:type="spellEnd"/>
-      <w:r>
-        <w:rPr>
-          <w:rFonts w:ascii="Arial" w:eastAsia="Arial" w:hAnsi="Arial" w:cs="Arial"/>
-          <w:color w:val="000000"/>
-          <w:sz w:val="22"/>
-          <w:szCs w:val="22"/>
-        </w:rPr>
-        <w:t xml:space="preserve"> Pages"; a technology that is used to create web pages that can display changing information</w:t>
-      </w:r>
-      <w:r>
-        <w:rPr>
-          <w:rFonts w:ascii="Arial" w:eastAsia="Arial" w:hAnsi="Arial" w:cs="Arial"/>
-          <w:color w:val="000000"/>
-          <w:sz w:val="22"/>
-          <w:szCs w:val="22"/>
-        </w:rPr>
-        <w:t xml:space="preserve"> (dynamic)</w:t>
-      </w:r>
-      <w:r>
-        <w:rPr>
-          <w:rFonts w:ascii="Arial" w:eastAsia="Arial" w:hAnsi="Arial" w:cs="Arial"/>
-          <w:color w:val="000000"/>
-          <w:sz w:val="22"/>
-          <w:szCs w:val="22"/>
-        </w:rPr>
-        <w:t xml:space="preserve"> from a Java-based web application</w:t>
-      </w:r>
-      <w:r>
-        <w:rPr>
-          <w:rFonts w:ascii="Arial" w:eastAsia="Arial" w:hAnsi="Arial" w:cs="Arial"/>
-          <w:color w:val="000000"/>
-          <w:sz w:val="22"/>
-          <w:szCs w:val="22"/>
-        </w:rPr>
-        <w:t xml:space="preserve">. For example, if a </w:t>
+        <w:t xml:space="preserve"> from a Java-based web application. For example, if a </w:t>
       </w:r>
       <w:r>
         <w:rPr>
@@ -1506,12 +1466,6 @@
         <w:gridCol w:w="4434"/>
       </w:tblGrid>
       <w:tr>
-        <w:tblPrEx>
-          <w:tblCellMar>
-            <w:top w:w="0" w:type="dxa"/>
-            <w:bottom w:w="0" w:type="dxa"/>
-          </w:tblCellMar>
-        </w:tblPrEx>
         <w:tc>
           <w:tcPr>
             <w:tcW w:w="4926" w:type="dxa"/>
@@ -1876,12 +1830,6 @@
         </w:tc>
       </w:tr>
       <w:tr>
-        <w:tblPrEx>
-          <w:tblCellMar>
-            <w:top w:w="0" w:type="dxa"/>
-            <w:bottom w:w="0" w:type="dxa"/>
-          </w:tblCellMar>
-        </w:tblPrEx>
         <w:tc>
           <w:tcPr>
             <w:tcW w:w="9360" w:type="dxa"/>
@@ -2129,10 +2077,6 @@
             <w:insideH w:val="single" w:sz="6" w:space="0" w:color="FFFFFF"/>
             <w:insideV w:val="single" w:sz="6" w:space="0" w:color="FFFFFF"/>
           </w:tblBorders>
-          <w:tblCellMar>
-            <w:top w:w="0" w:type="dxa"/>
-            <w:bottom w:w="0" w:type="dxa"/>
-          </w:tblCellMar>
         </w:tblPrEx>
         <w:tc>
           <w:tcPr>
@@ -2467,10 +2411,6 @@
             <w:insideH w:val="single" w:sz="6" w:space="0" w:color="FFFFFF"/>
             <w:insideV w:val="single" w:sz="6" w:space="0" w:color="FFFFFF"/>
           </w:tblBorders>
-          <w:tblCellMar>
-            <w:top w:w="0" w:type="dxa"/>
-            <w:bottom w:w="0" w:type="dxa"/>
-          </w:tblCellMar>
         </w:tblPrEx>
         <w:tc>
           <w:tcPr>
@@ -2772,12 +2712,6 @@
         <w:gridCol w:w="4849"/>
       </w:tblGrid>
       <w:tr>
-        <w:tblPrEx>
-          <w:tblCellMar>
-            <w:top w:w="0" w:type="dxa"/>
-            <w:bottom w:w="0" w:type="dxa"/>
-          </w:tblCellMar>
-        </w:tblPrEx>
         <w:tc>
           <w:tcPr>
             <w:tcW w:w="4511" w:type="dxa"/>
@@ -3071,12 +3005,6 @@
         </w:tc>
       </w:tr>
       <w:tr>
-        <w:tblPrEx>
-          <w:tblCellMar>
-            <w:top w:w="0" w:type="dxa"/>
-            <w:bottom w:w="0" w:type="dxa"/>
-          </w:tblCellMar>
-        </w:tblPrEx>
         <w:tc>
           <w:tcPr>
             <w:tcW w:w="9360" w:type="dxa"/>
@@ -3447,12 +3375,6 @@
         <w:gridCol w:w="1565"/>
       </w:tblGrid>
       <w:tr>
-        <w:tblPrEx>
-          <w:tblCellMar>
-            <w:top w:w="0" w:type="dxa"/>
-            <w:bottom w:w="0" w:type="dxa"/>
-          </w:tblCellMar>
-        </w:tblPrEx>
         <w:trPr>
           <w:tblHeader/>
         </w:trPr>
@@ -3590,12 +3512,6 @@
         </w:tc>
       </w:tr>
       <w:tr>
-        <w:tblPrEx>
-          <w:tblCellMar>
-            <w:top w:w="0" w:type="dxa"/>
-            <w:bottom w:w="0" w:type="dxa"/>
-          </w:tblCellMar>
-        </w:tblPrEx>
         <w:tc>
           <w:tcPr>
             <w:tcW w:w="12180" w:type="dxa"/>
@@ -3631,12 +3547,6 @@
         </w:tc>
       </w:tr>
       <w:tr>
-        <w:tblPrEx>
-          <w:tblCellMar>
-            <w:top w:w="0" w:type="dxa"/>
-            <w:bottom w:w="0" w:type="dxa"/>
-          </w:tblCellMar>
-        </w:tblPrEx>
         <w:tc>
           <w:tcPr>
             <w:tcW w:w="2449" w:type="dxa"/>
@@ -3765,12 +3675,6 @@
         </w:tc>
       </w:tr>
       <w:tr>
-        <w:tblPrEx>
-          <w:tblCellMar>
-            <w:top w:w="0" w:type="dxa"/>
-            <w:bottom w:w="0" w:type="dxa"/>
-          </w:tblCellMar>
-        </w:tblPrEx>
         <w:tc>
           <w:tcPr>
             <w:tcW w:w="2449" w:type="dxa"/>
@@ -3903,12 +3807,6 @@
         </w:tc>
       </w:tr>
       <w:tr>
-        <w:tblPrEx>
-          <w:tblCellMar>
-            <w:top w:w="0" w:type="dxa"/>
-            <w:bottom w:w="0" w:type="dxa"/>
-          </w:tblCellMar>
-        </w:tblPrEx>
         <w:tc>
           <w:tcPr>
             <w:tcW w:w="12180" w:type="dxa"/>
@@ -3944,12 +3842,6 @@
         </w:tc>
       </w:tr>
       <w:tr>
-        <w:tblPrEx>
-          <w:tblCellMar>
-            <w:top w:w="0" w:type="dxa"/>
-            <w:bottom w:w="0" w:type="dxa"/>
-          </w:tblCellMar>
-        </w:tblPrEx>
         <w:tc>
           <w:tcPr>
             <w:tcW w:w="2449" w:type="dxa"/>
@@ -4078,12 +3970,6 @@
         </w:tc>
       </w:tr>
       <w:tr>
-        <w:tblPrEx>
-          <w:tblCellMar>
-            <w:top w:w="0" w:type="dxa"/>
-            <w:bottom w:w="0" w:type="dxa"/>
-          </w:tblCellMar>
-        </w:tblPrEx>
         <w:tc>
           <w:tcPr>
             <w:tcW w:w="2449" w:type="dxa"/>
@@ -4216,12 +4102,6 @@
         </w:tc>
       </w:tr>
       <w:tr>
-        <w:tblPrEx>
-          <w:tblCellMar>
-            <w:top w:w="0" w:type="dxa"/>
-            <w:bottom w:w="0" w:type="dxa"/>
-          </w:tblCellMar>
-        </w:tblPrEx>
         <w:tc>
           <w:tcPr>
             <w:tcW w:w="12180" w:type="dxa"/>
@@ -4257,12 +4137,6 @@
         </w:tc>
       </w:tr>
       <w:tr>
-        <w:tblPrEx>
-          <w:tblCellMar>
-            <w:top w:w="0" w:type="dxa"/>
-            <w:bottom w:w="0" w:type="dxa"/>
-          </w:tblCellMar>
-        </w:tblPrEx>
         <w:tc>
           <w:tcPr>
             <w:tcW w:w="2449" w:type="dxa"/>
@@ -4391,12 +4265,6 @@
         </w:tc>
       </w:tr>
       <w:tr>
-        <w:tblPrEx>
-          <w:tblCellMar>
-            <w:top w:w="0" w:type="dxa"/>
-            <w:bottom w:w="0" w:type="dxa"/>
-          </w:tblCellMar>
-        </w:tblPrEx>
         <w:tc>
           <w:tcPr>
             <w:tcW w:w="12180" w:type="dxa"/>
@@ -4469,12 +4337,6 @@
         </w:tc>
       </w:tr>
       <w:tr>
-        <w:tblPrEx>
-          <w:tblCellMar>
-            <w:top w:w="0" w:type="dxa"/>
-            <w:bottom w:w="0" w:type="dxa"/>
-          </w:tblCellMar>
-        </w:tblPrEx>
         <w:tc>
           <w:tcPr>
             <w:tcW w:w="2449" w:type="dxa"/>
@@ -4500,7 +4362,6 @@
                 <w:sz w:val="22"/>
                 <w:szCs w:val="22"/>
               </w:rPr>
-              <w:lastRenderedPageBreak/>
               <w:t>Database Schema</w:t>
             </w:r>
           </w:p>
@@ -4604,12 +4465,6 @@
         </w:tc>
       </w:tr>
       <w:tr>
-        <w:tblPrEx>
-          <w:tblCellMar>
-            <w:top w:w="0" w:type="dxa"/>
-            <w:bottom w:w="0" w:type="dxa"/>
-          </w:tblCellMar>
-        </w:tblPrEx>
         <w:tc>
           <w:tcPr>
             <w:tcW w:w="2449" w:type="dxa"/>
@@ -4742,12 +4597,6 @@
         </w:tc>
       </w:tr>
       <w:tr>
-        <w:tblPrEx>
-          <w:tblCellMar>
-            <w:top w:w="0" w:type="dxa"/>
-            <w:bottom w:w="0" w:type="dxa"/>
-          </w:tblCellMar>
-        </w:tblPrEx>
         <w:tc>
           <w:tcPr>
             <w:tcW w:w="2449" w:type="dxa"/>
@@ -4876,12 +4725,6 @@
         </w:tc>
       </w:tr>
       <w:tr>
-        <w:tblPrEx>
-          <w:tblCellMar>
-            <w:top w:w="0" w:type="dxa"/>
-            <w:bottom w:w="0" w:type="dxa"/>
-          </w:tblCellMar>
-        </w:tblPrEx>
         <w:tc>
           <w:tcPr>
             <w:tcW w:w="2449" w:type="dxa"/>
@@ -5014,12 +4857,6 @@
         </w:tc>
       </w:tr>
       <w:tr>
-        <w:tblPrEx>
-          <w:tblCellMar>
-            <w:top w:w="0" w:type="dxa"/>
-            <w:bottom w:w="0" w:type="dxa"/>
-          </w:tblCellMar>
-        </w:tblPrEx>
         <w:tc>
           <w:tcPr>
             <w:tcW w:w="12180" w:type="dxa"/>
@@ -5055,12 +4892,6 @@
         </w:tc>
       </w:tr>
       <w:tr>
-        <w:tblPrEx>
-          <w:tblCellMar>
-            <w:top w:w="0" w:type="dxa"/>
-            <w:bottom w:w="0" w:type="dxa"/>
-          </w:tblCellMar>
-        </w:tblPrEx>
         <w:tc>
           <w:tcPr>
             <w:tcW w:w="2449" w:type="dxa"/>
@@ -5189,12 +5020,6 @@
         </w:tc>
       </w:tr>
       <w:tr>
-        <w:tblPrEx>
-          <w:tblCellMar>
-            <w:top w:w="0" w:type="dxa"/>
-            <w:bottom w:w="0" w:type="dxa"/>
-          </w:tblCellMar>
-        </w:tblPrEx>
         <w:tc>
           <w:tcPr>
             <w:tcW w:w="2449" w:type="dxa"/>
@@ -5327,12 +5152,6 @@
         </w:tc>
       </w:tr>
       <w:tr>
-        <w:tblPrEx>
-          <w:tblCellMar>
-            <w:top w:w="0" w:type="dxa"/>
-            <w:bottom w:w="0" w:type="dxa"/>
-          </w:tblCellMar>
-        </w:tblPrEx>
         <w:tc>
           <w:tcPr>
             <w:tcW w:w="2449" w:type="dxa"/>
@@ -5459,12 +5278,6 @@
         </w:tc>
       </w:tr>
       <w:tr>
-        <w:tblPrEx>
-          <w:tblCellMar>
-            <w:top w:w="0" w:type="dxa"/>
-            <w:bottom w:w="0" w:type="dxa"/>
-          </w:tblCellMar>
-        </w:tblPrEx>
         <w:tc>
           <w:tcPr>
             <w:tcW w:w="2449" w:type="dxa"/>
@@ -5597,12 +5410,6 @@
         </w:tc>
       </w:tr>
       <w:tr>
-        <w:tblPrEx>
-          <w:tblCellMar>
-            <w:top w:w="0" w:type="dxa"/>
-            <w:bottom w:w="0" w:type="dxa"/>
-          </w:tblCellMar>
-        </w:tblPrEx>
         <w:tc>
           <w:tcPr>
             <w:tcW w:w="2449" w:type="dxa"/>
@@ -5732,12 +5539,6 @@
         </w:tc>
       </w:tr>
       <w:tr>
-        <w:tblPrEx>
-          <w:tblCellMar>
-            <w:top w:w="0" w:type="dxa"/>
-            <w:bottom w:w="0" w:type="dxa"/>
-          </w:tblCellMar>
-        </w:tblPrEx>
         <w:tc>
           <w:tcPr>
             <w:tcW w:w="2449" w:type="dxa"/>
@@ -5868,12 +5669,6 @@
         </w:tc>
       </w:tr>
       <w:tr>
-        <w:tblPrEx>
-          <w:tblCellMar>
-            <w:top w:w="0" w:type="dxa"/>
-            <w:bottom w:w="0" w:type="dxa"/>
-          </w:tblCellMar>
-        </w:tblPrEx>
         <w:tc>
           <w:tcPr>
             <w:tcW w:w="2449" w:type="dxa"/>
@@ -6002,12 +5797,6 @@
         </w:tc>
       </w:tr>
       <w:tr>
-        <w:tblPrEx>
-          <w:tblCellMar>
-            <w:top w:w="0" w:type="dxa"/>
-            <w:bottom w:w="0" w:type="dxa"/>
-          </w:tblCellMar>
-        </w:tblPrEx>
         <w:tc>
           <w:tcPr>
             <w:tcW w:w="2449" w:type="dxa"/>
@@ -6158,12 +5947,6 @@
         </w:tc>
       </w:tr>
       <w:tr>
-        <w:tblPrEx>
-          <w:tblCellMar>
-            <w:top w:w="0" w:type="dxa"/>
-            <w:bottom w:w="0" w:type="dxa"/>
-          </w:tblCellMar>
-        </w:tblPrEx>
         <w:tc>
           <w:tcPr>
             <w:tcW w:w="2449" w:type="dxa"/>
@@ -6312,12 +6095,6 @@
         </w:tc>
       </w:tr>
       <w:tr>
-        <w:tblPrEx>
-          <w:tblCellMar>
-            <w:top w:w="0" w:type="dxa"/>
-            <w:bottom w:w="0" w:type="dxa"/>
-          </w:tblCellMar>
-        </w:tblPrEx>
         <w:tc>
           <w:tcPr>
             <w:tcW w:w="2449" w:type="dxa"/>
@@ -6450,12 +6227,6 @@
         </w:tc>
       </w:tr>
       <w:tr>
-        <w:tblPrEx>
-          <w:tblCellMar>
-            <w:top w:w="0" w:type="dxa"/>
-            <w:bottom w:w="0" w:type="dxa"/>
-          </w:tblCellMar>
-        </w:tblPrEx>
         <w:tc>
           <w:tcPr>
             <w:tcW w:w="12180" w:type="dxa"/>
@@ -6491,12 +6262,6 @@
         </w:tc>
       </w:tr>
       <w:tr>
-        <w:tblPrEx>
-          <w:tblCellMar>
-            <w:top w:w="0" w:type="dxa"/>
-            <w:bottom w:w="0" w:type="dxa"/>
-          </w:tblCellMar>
-        </w:tblPrEx>
         <w:tc>
           <w:tcPr>
             <w:tcW w:w="2449" w:type="dxa"/>
@@ -6625,12 +6390,6 @@
         </w:tc>
       </w:tr>
       <w:tr>
-        <w:tblPrEx>
-          <w:tblCellMar>
-            <w:top w:w="0" w:type="dxa"/>
-            <w:bottom w:w="0" w:type="dxa"/>
-          </w:tblCellMar>
-        </w:tblPrEx>
         <w:tc>
           <w:tcPr>
             <w:tcW w:w="2449" w:type="dxa"/>
@@ -6763,12 +6522,6 @@
         </w:tc>
       </w:tr>
       <w:tr>
-        <w:tblPrEx>
-          <w:tblCellMar>
-            <w:top w:w="0" w:type="dxa"/>
-            <w:bottom w:w="0" w:type="dxa"/>
-          </w:tblCellMar>
-        </w:tblPrEx>
         <w:tc>
           <w:tcPr>
             <w:tcW w:w="2449" w:type="dxa"/>
@@ -6895,12 +6648,6 @@
         </w:tc>
       </w:tr>
       <w:tr>
-        <w:tblPrEx>
-          <w:tblCellMar>
-            <w:top w:w="0" w:type="dxa"/>
-            <w:bottom w:w="0" w:type="dxa"/>
-          </w:tblCellMar>
-        </w:tblPrEx>
         <w:tc>
           <w:tcPr>
             <w:tcW w:w="2449" w:type="dxa"/>
@@ -7034,12 +6781,6 @@
         </w:tc>
       </w:tr>
       <w:tr>
-        <w:tblPrEx>
-          <w:tblCellMar>
-            <w:top w:w="0" w:type="dxa"/>
-            <w:bottom w:w="0" w:type="dxa"/>
-          </w:tblCellMar>
-        </w:tblPrEx>
         <w:tc>
           <w:tcPr>
             <w:tcW w:w="2449" w:type="dxa"/>
@@ -7168,12 +6909,6 @@
         </w:tc>
       </w:tr>
       <w:tr>
-        <w:tblPrEx>
-          <w:tblCellMar>
-            <w:top w:w="0" w:type="dxa"/>
-            <w:bottom w:w="0" w:type="dxa"/>
-          </w:tblCellMar>
-        </w:tblPrEx>
         <w:tc>
           <w:tcPr>
             <w:tcW w:w="2449" w:type="dxa"/>
@@ -7304,12 +7039,6 @@
         </w:tc>
       </w:tr>
       <w:tr>
-        <w:tblPrEx>
-          <w:tblCellMar>
-            <w:top w:w="0" w:type="dxa"/>
-            <w:bottom w:w="0" w:type="dxa"/>
-          </w:tblCellMar>
-        </w:tblPrEx>
         <w:tc>
           <w:tcPr>
             <w:tcW w:w="2449" w:type="dxa"/>
@@ -7438,12 +7167,6 @@
         </w:tc>
       </w:tr>
       <w:tr>
-        <w:tblPrEx>
-          <w:tblCellMar>
-            <w:top w:w="0" w:type="dxa"/>
-            <w:bottom w:w="0" w:type="dxa"/>
-          </w:tblCellMar>
-        </w:tblPrEx>
         <w:tc>
           <w:tcPr>
             <w:tcW w:w="2449" w:type="dxa"/>
@@ -7576,12 +7299,6 @@
         </w:tc>
       </w:tr>
       <w:tr>
-        <w:tblPrEx>
-          <w:tblCellMar>
-            <w:top w:w="0" w:type="dxa"/>
-            <w:bottom w:w="0" w:type="dxa"/>
-          </w:tblCellMar>
-        </w:tblPrEx>
         <w:tc>
           <w:tcPr>
             <w:tcW w:w="2449" w:type="dxa"/>
@@ -7708,12 +7425,6 @@
         </w:tc>
       </w:tr>
       <w:tr>
-        <w:tblPrEx>
-          <w:tblCellMar>
-            <w:top w:w="0" w:type="dxa"/>
-            <w:bottom w:w="0" w:type="dxa"/>
-          </w:tblCellMar>
-        </w:tblPrEx>
         <w:tc>
           <w:tcPr>
             <w:tcW w:w="2449" w:type="dxa"/>
@@ -7846,12 +7557,6 @@
         </w:tc>
       </w:tr>
       <w:tr>
-        <w:tblPrEx>
-          <w:tblCellMar>
-            <w:top w:w="0" w:type="dxa"/>
-            <w:bottom w:w="0" w:type="dxa"/>
-          </w:tblCellMar>
-        </w:tblPrEx>
         <w:tc>
           <w:tcPr>
             <w:tcW w:w="2449" w:type="dxa"/>
@@ -7988,12 +7693,6 @@
         </w:tc>
       </w:tr>
       <w:tr>
-        <w:tblPrEx>
-          <w:tblCellMar>
-            <w:top w:w="0" w:type="dxa"/>
-            <w:bottom w:w="0" w:type="dxa"/>
-          </w:tblCellMar>
-        </w:tblPrEx>
         <w:tc>
           <w:tcPr>
             <w:tcW w:w="12180" w:type="dxa"/>
@@ -8041,12 +7740,6 @@
         </w:tc>
       </w:tr>
       <w:tr>
-        <w:tblPrEx>
-          <w:tblCellMar>
-            <w:top w:w="0" w:type="dxa"/>
-            <w:bottom w:w="0" w:type="dxa"/>
-          </w:tblCellMar>
-        </w:tblPrEx>
         <w:tc>
           <w:tcPr>
             <w:tcW w:w="2449" w:type="dxa"/>
@@ -8175,12 +7868,6 @@
         </w:tc>
       </w:tr>
       <w:tr>
-        <w:tblPrEx>
-          <w:tblCellMar>
-            <w:top w:w="0" w:type="dxa"/>
-            <w:bottom w:w="0" w:type="dxa"/>
-          </w:tblCellMar>
-        </w:tblPrEx>
         <w:tc>
           <w:tcPr>
             <w:tcW w:w="2449" w:type="dxa"/>
@@ -8314,12 +8001,6 @@
         </w:tc>
       </w:tr>
       <w:tr>
-        <w:tblPrEx>
-          <w:tblCellMar>
-            <w:top w:w="0" w:type="dxa"/>
-            <w:bottom w:w="0" w:type="dxa"/>
-          </w:tblCellMar>
-        </w:tblPrEx>
         <w:tc>
           <w:tcPr>
             <w:tcW w:w="2449" w:type="dxa"/>
@@ -8446,12 +8127,6 @@
         </w:tc>
       </w:tr>
       <w:tr>
-        <w:tblPrEx>
-          <w:tblCellMar>
-            <w:top w:w="0" w:type="dxa"/>
-            <w:bottom w:w="0" w:type="dxa"/>
-          </w:tblCellMar>
-        </w:tblPrEx>
         <w:tc>
           <w:tcPr>
             <w:tcW w:w="2449" w:type="dxa"/>
@@ -8584,12 +8259,6 @@
         </w:tc>
       </w:tr>
       <w:tr>
-        <w:tblPrEx>
-          <w:tblCellMar>
-            <w:top w:w="0" w:type="dxa"/>
-            <w:bottom w:w="0" w:type="dxa"/>
-          </w:tblCellMar>
-        </w:tblPrEx>
         <w:tc>
           <w:tcPr>
             <w:tcW w:w="2449" w:type="dxa"/>
@@ -8718,12 +8387,6 @@
         </w:tc>
       </w:tr>
       <w:tr>
-        <w:tblPrEx>
-          <w:tblCellMar>
-            <w:top w:w="0" w:type="dxa"/>
-            <w:bottom w:w="0" w:type="dxa"/>
-          </w:tblCellMar>
-        </w:tblPrEx>
         <w:tc>
           <w:tcPr>
             <w:tcW w:w="2449" w:type="dxa"/>
@@ -8854,12 +8517,6 @@
         </w:tc>
       </w:tr>
       <w:tr>
-        <w:tblPrEx>
-          <w:tblCellMar>
-            <w:top w:w="0" w:type="dxa"/>
-            <w:bottom w:w="0" w:type="dxa"/>
-          </w:tblCellMar>
-        </w:tblPrEx>
         <w:tc>
           <w:tcPr>
             <w:tcW w:w="2449" w:type="dxa"/>
@@ -8988,12 +8645,6 @@
         </w:tc>
       </w:tr>
       <w:tr>
-        <w:tblPrEx>
-          <w:tblCellMar>
-            <w:top w:w="0" w:type="dxa"/>
-            <w:bottom w:w="0" w:type="dxa"/>
-          </w:tblCellMar>
-        </w:tblPrEx>
         <w:tc>
           <w:tcPr>
             <w:tcW w:w="2449" w:type="dxa"/>
@@ -9134,12 +8785,6 @@
         </w:tc>
       </w:tr>
       <w:tr>
-        <w:tblPrEx>
-          <w:tblCellMar>
-            <w:top w:w="0" w:type="dxa"/>
-            <w:bottom w:w="0" w:type="dxa"/>
-          </w:tblCellMar>
-        </w:tblPrEx>
         <w:tc>
           <w:tcPr>
             <w:tcW w:w="12180" w:type="dxa"/>
@@ -9175,12 +8820,6 @@
         </w:tc>
       </w:tr>
       <w:tr>
-        <w:tblPrEx>
-          <w:tblCellMar>
-            <w:top w:w="0" w:type="dxa"/>
-            <w:bottom w:w="0" w:type="dxa"/>
-          </w:tblCellMar>
-        </w:tblPrEx>
         <w:tc>
           <w:tcPr>
             <w:tcW w:w="2449" w:type="dxa"/>
@@ -9309,12 +8948,6 @@
         </w:tc>
       </w:tr>
       <w:tr>
-        <w:tblPrEx>
-          <w:tblCellMar>
-            <w:top w:w="0" w:type="dxa"/>
-            <w:bottom w:w="0" w:type="dxa"/>
-          </w:tblCellMar>
-        </w:tblPrEx>
         <w:tc>
           <w:tcPr>
             <w:tcW w:w="2449" w:type="dxa"/>
@@ -9447,12 +9080,6 @@
         </w:tc>
       </w:tr>
       <w:tr>
-        <w:tblPrEx>
-          <w:tblCellMar>
-            <w:top w:w="0" w:type="dxa"/>
-            <w:bottom w:w="0" w:type="dxa"/>
-          </w:tblCellMar>
-        </w:tblPrEx>
         <w:tc>
           <w:tcPr>
             <w:tcW w:w="2449" w:type="dxa"/>
@@ -9602,12 +9229,6 @@
         </w:tc>
       </w:tr>
       <w:tr>
-        <w:tblPrEx>
-          <w:tblCellMar>
-            <w:top w:w="0" w:type="dxa"/>
-            <w:bottom w:w="0" w:type="dxa"/>
-          </w:tblCellMar>
-        </w:tblPrEx>
         <w:tc>
           <w:tcPr>
             <w:tcW w:w="2449" w:type="dxa"/>
@@ -9740,12 +9361,6 @@
         </w:tc>
       </w:tr>
       <w:tr>
-        <w:tblPrEx>
-          <w:tblCellMar>
-            <w:top w:w="0" w:type="dxa"/>
-            <w:bottom w:w="0" w:type="dxa"/>
-          </w:tblCellMar>
-        </w:tblPrEx>
         <w:tc>
           <w:tcPr>
             <w:tcW w:w="12180" w:type="dxa"/>
@@ -9781,12 +9396,6 @@
         </w:tc>
       </w:tr>
       <w:tr>
-        <w:tblPrEx>
-          <w:tblCellMar>
-            <w:top w:w="0" w:type="dxa"/>
-            <w:bottom w:w="0" w:type="dxa"/>
-          </w:tblCellMar>
-        </w:tblPrEx>
         <w:tc>
           <w:tcPr>
             <w:tcW w:w="2449" w:type="dxa"/>
@@ -9915,12 +9524,6 @@
         </w:tc>
       </w:tr>
       <w:tr>
-        <w:tblPrEx>
-          <w:tblCellMar>
-            <w:top w:w="0" w:type="dxa"/>
-            <w:bottom w:w="0" w:type="dxa"/>
-          </w:tblCellMar>
-        </w:tblPrEx>
         <w:tc>
           <w:tcPr>
             <w:tcW w:w="2449" w:type="dxa"/>
@@ -10053,12 +9656,6 @@
         </w:tc>
       </w:tr>
       <w:tr>
-        <w:tblPrEx>
-          <w:tblCellMar>
-            <w:top w:w="0" w:type="dxa"/>
-            <w:bottom w:w="0" w:type="dxa"/>
-          </w:tblCellMar>
-        </w:tblPrEx>
         <w:tc>
           <w:tcPr>
             <w:tcW w:w="12180" w:type="dxa"/>
@@ -10094,12 +9691,6 @@
         </w:tc>
       </w:tr>
       <w:tr>
-        <w:tblPrEx>
-          <w:tblCellMar>
-            <w:top w:w="0" w:type="dxa"/>
-            <w:bottom w:w="0" w:type="dxa"/>
-          </w:tblCellMar>
-        </w:tblPrEx>
         <w:tc>
           <w:tcPr>
             <w:tcW w:w="2449" w:type="dxa"/>
@@ -10236,12 +9827,6 @@
         </w:tc>
       </w:tr>
       <w:tr>
-        <w:tblPrEx>
-          <w:tblCellMar>
-            <w:top w:w="0" w:type="dxa"/>
-            <w:bottom w:w="0" w:type="dxa"/>
-          </w:tblCellMar>
-        </w:tblPrEx>
         <w:tc>
           <w:tcPr>
             <w:tcW w:w="2449" w:type="dxa"/>
@@ -10374,12 +9959,6 @@
         </w:tc>
       </w:tr>
       <w:tr>
-        <w:tblPrEx>
-          <w:tblCellMar>
-            <w:top w:w="0" w:type="dxa"/>
-            <w:bottom w:w="0" w:type="dxa"/>
-          </w:tblCellMar>
-        </w:tblPrEx>
         <w:tc>
           <w:tcPr>
             <w:tcW w:w="2449" w:type="dxa"/>
@@ -10508,12 +10087,6 @@
         </w:tc>
       </w:tr>
       <w:tr>
-        <w:tblPrEx>
-          <w:tblCellMar>
-            <w:top w:w="0" w:type="dxa"/>
-            <w:bottom w:w="0" w:type="dxa"/>
-          </w:tblCellMar>
-        </w:tblPrEx>
         <w:tc>
           <w:tcPr>
             <w:tcW w:w="2449" w:type="dxa"/>
@@ -12551,6 +12124,7 @@
   <w:style w:type="character" w:default="1" w:styleId="DefaultParagraphFont">
     <w:name w:val="Default Paragraph Font"/>
     <w:uiPriority w:val="1"/>
+    <w:semiHidden/>
     <w:unhideWhenUsed/>
   </w:style>
   <w:style w:type="table" w:default="1" w:styleId="TableNormal">

</xml_diff>

<commit_message>
Correct TDD draft files
</commit_message>
<xml_diff>
--- a/Module-1/BlueGroup_CSD460_TDD-Mod1_2.docx
+++ b/Module-1/BlueGroup_CSD460_TDD-Mod1_2.docx
@@ -15,16 +15,16 @@
           <w:noProof/>
         </w:rPr>
         <w:drawing>
-          <wp:anchor distT="0" distB="0" distL="114300" distR="114300" simplePos="0" relativeHeight="251659264" behindDoc="0" locked="0" layoutInCell="1" allowOverlap="1" wp14:anchorId="34AEF419" wp14:editId="51B4BA42">
+          <wp:anchor distT="0" distB="0" distL="114300" distR="114300" simplePos="0" relativeHeight="251659264" behindDoc="0" locked="0" layoutInCell="1" allowOverlap="1" wp14:anchorId="34AEF419" wp14:editId="52B7CFE1">
             <wp:simplePos x="0" y="0"/>
             <wp:positionH relativeFrom="page">
-              <wp:posOffset>7620</wp:posOffset>
+              <wp:posOffset>-22860</wp:posOffset>
             </wp:positionH>
             <wp:positionV relativeFrom="page">
-              <wp:posOffset>15240</wp:posOffset>
+              <wp:posOffset>-30480</wp:posOffset>
             </wp:positionV>
-            <wp:extent cx="7772400" cy="2331720"/>
-            <wp:effectExtent l="0" t="0" r="0" b="0"/>
+            <wp:extent cx="7924800" cy="2377440"/>
+            <wp:effectExtent l="0" t="0" r="0" b="3810"/>
             <wp:wrapTopAndBottom/>
             <wp:docPr id="1513724553" name="Drawing 0" descr="183503720-e17d-4a18-b062-54610075e780.png"/>
             <wp:cNvGraphicFramePr>
@@ -48,7 +48,7 @@
                   <pic:spPr>
                     <a:xfrm>
                       <a:off x="0" y="0"/>
-                      <a:ext cx="7772400" cy="2331720"/>
+                      <a:ext cx="7924800" cy="2377440"/>
                     </a:xfrm>
                     <a:prstGeom prst="rect">
                       <a:avLst/>
@@ -57,6 +57,12 @@
                 </pic:pic>
               </a:graphicData>
             </a:graphic>
+            <wp14:sizeRelH relativeFrom="margin">
+              <wp14:pctWidth>0</wp14:pctWidth>
+            </wp14:sizeRelH>
+            <wp14:sizeRelV relativeFrom="margin">
+              <wp14:pctHeight>0</wp14:pctHeight>
+            </wp14:sizeRelV>
           </wp:anchor>
         </w:drawing>
       </w:r>
@@ -469,27 +475,7 @@
           <w:sz w:val="22"/>
           <w:szCs w:val="22"/>
         </w:rPr>
-        <w:t xml:space="preserve"> - "in web security, it is the process of verifying the claimed identity of some entity, such as a user. This then makes it possible to decide whether to grant the user the access that they are requesting, such as </w:t>
-      </w:r>
-      <w:proofErr w:type="gramStart"/>
-      <w:r>
-        <w:rPr>
-          <w:rFonts w:ascii="Arial" w:eastAsia="Arial" w:hAnsi="Arial" w:cs="Arial"/>
-          <w:color w:val="000000"/>
-          <w:sz w:val="22"/>
-          <w:szCs w:val="22"/>
-        </w:rPr>
-        <w:t>being signed</w:t>
-      </w:r>
-      <w:proofErr w:type="gramEnd"/>
-      <w:r>
-        <w:rPr>
-          <w:rFonts w:ascii="Arial" w:eastAsia="Arial" w:hAnsi="Arial" w:cs="Arial"/>
-          <w:color w:val="000000"/>
-          <w:sz w:val="22"/>
-          <w:szCs w:val="22"/>
-        </w:rPr>
-        <w:t xml:space="preserve"> into a particular account." </w:t>
+        <w:t xml:space="preserve"> - "in web security, it is the process of verifying the claimed identity of some entity, such as a user. This then makes it possible to decide whether to grant the user the access that they are requesting, such as being signed into a particular account." </w:t>
       </w:r>
       <w:r>
         <w:rPr>
@@ -598,7 +584,6 @@
           <w:szCs w:val="22"/>
         </w:rPr>
       </w:pPr>
-      <w:proofErr w:type="spellStart"/>
       <w:r>
         <w:rPr>
           <w:rFonts w:ascii="Arial" w:eastAsia="Arial" w:hAnsi="Arial" w:cs="Arial"/>
@@ -609,7 +594,6 @@
         </w:rPr>
         <w:t>CustomerID</w:t>
       </w:r>
-      <w:proofErr w:type="spellEnd"/>
       <w:r>
         <w:rPr>
           <w:rFonts w:ascii="Arial" w:eastAsia="Arial" w:hAnsi="Arial" w:cs="Arial"/>
@@ -630,7 +614,6 @@
           <w:szCs w:val="22"/>
         </w:rPr>
       </w:pPr>
-      <w:proofErr w:type="spellStart"/>
       <w:r>
         <w:rPr>
           <w:rFonts w:ascii="Arial" w:eastAsia="Arial" w:hAnsi="Arial" w:cs="Arial"/>
@@ -641,7 +624,6 @@
         </w:rPr>
         <w:t>ReservationID</w:t>
       </w:r>
-      <w:proofErr w:type="spellEnd"/>
       <w:r>
         <w:rPr>
           <w:rFonts w:ascii="Arial" w:eastAsia="Arial" w:hAnsi="Arial" w:cs="Arial"/>
@@ -986,27 +968,7 @@
           <w:sz w:val="22"/>
           <w:szCs w:val="22"/>
         </w:rPr>
-        <w:t xml:space="preserve"> - stands for "</w:t>
-      </w:r>
-      <w:proofErr w:type="spellStart"/>
-      <w:r>
-        <w:rPr>
-          <w:rFonts w:ascii="Arial" w:eastAsia="Arial" w:hAnsi="Arial" w:cs="Arial"/>
-          <w:color w:val="000000"/>
-          <w:sz w:val="22"/>
-          <w:szCs w:val="22"/>
-        </w:rPr>
-        <w:t>HyperText</w:t>
-      </w:r>
-      <w:proofErr w:type="spellEnd"/>
-      <w:r>
-        <w:rPr>
-          <w:rFonts w:ascii="Arial" w:eastAsia="Arial" w:hAnsi="Arial" w:cs="Arial"/>
-          <w:color w:val="000000"/>
-          <w:sz w:val="22"/>
-          <w:szCs w:val="22"/>
-        </w:rPr>
-        <w:t xml:space="preserve"> Markup Language"; this is the standard language that is used to create website content </w:t>
+        <w:t xml:space="preserve"> - stands for "HyperText Markup Language"; this is the standard language that is used to create website content </w:t>
       </w:r>
       <w:r>
         <w:rPr>
@@ -1084,27 +1046,7 @@
           <w:sz w:val="22"/>
           <w:szCs w:val="22"/>
         </w:rPr>
-        <w:t xml:space="preserve"> - stands for "</w:t>
-      </w:r>
-      <w:proofErr w:type="spellStart"/>
-      <w:r>
-        <w:rPr>
-          <w:rFonts w:ascii="Arial" w:eastAsia="Arial" w:hAnsi="Arial" w:cs="Arial"/>
-          <w:color w:val="000000"/>
-          <w:sz w:val="22"/>
-          <w:szCs w:val="22"/>
-        </w:rPr>
-        <w:t>JavaServer</w:t>
-      </w:r>
-      <w:proofErr w:type="spellEnd"/>
-      <w:r>
-        <w:rPr>
-          <w:rFonts w:ascii="Arial" w:eastAsia="Arial" w:hAnsi="Arial" w:cs="Arial"/>
-          <w:color w:val="000000"/>
-          <w:sz w:val="22"/>
-          <w:szCs w:val="22"/>
-        </w:rPr>
-        <w:t xml:space="preserve"> Pages"; a technology that is used to create web pages that can display changing information</w:t>
+        <w:t xml:space="preserve"> - stands for "JavaServer Pages"; a technology that is used to create web pages that can display changing information</w:t>
       </w:r>
       <w:r>
         <w:rPr>
@@ -3057,27 +2999,7 @@
                 <w:sz w:val="22"/>
                 <w:szCs w:val="22"/>
               </w:rPr>
-              <w:t xml:space="preserve">Walt is a 68-year-old retired electrician and widower who escapes the snow each winter at Moffatt Bay Marina Lodge. From November through </w:t>
-            </w:r>
-            <w:proofErr w:type="gramStart"/>
-            <w:r>
-              <w:rPr>
-                <w:rFonts w:ascii="Arial" w:eastAsia="Arial" w:hAnsi="Arial" w:cs="Arial"/>
-                <w:color w:val="000000"/>
-                <w:sz w:val="22"/>
-                <w:szCs w:val="22"/>
-              </w:rPr>
-              <w:t>February</w:t>
-            </w:r>
-            <w:proofErr w:type="gramEnd"/>
-            <w:r>
-              <w:rPr>
-                <w:rFonts w:ascii="Arial" w:eastAsia="Arial" w:hAnsi="Arial" w:cs="Arial"/>
-                <w:color w:val="000000"/>
-                <w:sz w:val="22"/>
-                <w:szCs w:val="22"/>
-              </w:rPr>
-              <w:t xml:space="preserve"> he stays at the lodge for three to four months, keeps his boat in a dock slip, and spends most days out fishing. Since losing his wife, Walt values reliability, simplicity, and a sense of community. </w:t>
+              <w:t xml:space="preserve">Walt is a 68-year-old retired electrician and widower who escapes the snow each winter at Moffatt Bay Marina Lodge. From November through February he stays at the lodge for three to four months, keeps his boat in a dock slip, and spends most days out fishing. Since losing his wife, Walt values reliability, simplicity, and a sense of community. </w:t>
             </w:r>
           </w:p>
           <w:p>
@@ -3142,27 +3064,7 @@
                 <w:sz w:val="22"/>
                 <w:szCs w:val="22"/>
               </w:rPr>
-              <w:t xml:space="preserve">Easy, bundled booking that </w:t>
-            </w:r>
-            <w:proofErr w:type="spellStart"/>
-            <w:r>
-              <w:rPr>
-                <w:rFonts w:ascii="Arial" w:eastAsia="Arial" w:hAnsi="Arial" w:cs="Arial"/>
-                <w:color w:val="000000"/>
-                <w:sz w:val="22"/>
-                <w:szCs w:val="22"/>
-              </w:rPr>
-              <w:t>hapirs</w:t>
-            </w:r>
-            <w:proofErr w:type="spellEnd"/>
-            <w:r>
-              <w:rPr>
-                <w:rFonts w:ascii="Arial" w:eastAsia="Arial" w:hAnsi="Arial" w:cs="Arial"/>
-                <w:color w:val="000000"/>
-                <w:sz w:val="22"/>
-                <w:szCs w:val="22"/>
-              </w:rPr>
-              <w:t xml:space="preserve"> his lodge room with his boat slip </w:t>
+              <w:t xml:space="preserve">Easy, bundled booking that hapirs his lodge room with his boat slip </w:t>
             </w:r>
           </w:p>
           <w:p>
@@ -3630,18 +3532,8 @@
                 <w:sz w:val="22"/>
                 <w:szCs w:val="22"/>
               </w:rPr>
-              <w:t xml:space="preserve">6 </w:t>
-            </w:r>
-            <w:proofErr w:type="spellStart"/>
-            <w:r>
-              <w:rPr>
-                <w:rFonts w:ascii="Arial" w:hAnsi="Arial" w:cs="Arial"/>
-                <w:sz w:val="22"/>
-                <w:szCs w:val="22"/>
-              </w:rPr>
-              <w:t>hrs</w:t>
-            </w:r>
-            <w:proofErr w:type="spellEnd"/>
+              <w:t>6 hrs</w:t>
+            </w:r>
           </w:p>
         </w:tc>
         <w:tc>
@@ -3761,18 +3653,8 @@
                 <w:sz w:val="22"/>
                 <w:szCs w:val="22"/>
               </w:rPr>
-              <w:t xml:space="preserve">4 </w:t>
-            </w:r>
-            <w:proofErr w:type="spellStart"/>
-            <w:r>
-              <w:rPr>
-                <w:rFonts w:ascii="Arial" w:hAnsi="Arial" w:cs="Arial"/>
-                <w:sz w:val="22"/>
-                <w:szCs w:val="22"/>
-              </w:rPr>
-              <w:t>hrs</w:t>
-            </w:r>
-            <w:proofErr w:type="spellEnd"/>
+              <w:t>4 hrs</w:t>
+            </w:r>
           </w:p>
         </w:tc>
         <w:tc>
@@ -3925,18 +3807,8 @@
                 <w:sz w:val="22"/>
                 <w:szCs w:val="22"/>
               </w:rPr>
-              <w:t xml:space="preserve">9 </w:t>
-            </w:r>
-            <w:proofErr w:type="spellStart"/>
-            <w:r>
-              <w:rPr>
-                <w:rFonts w:ascii="Arial" w:hAnsi="Arial" w:cs="Arial"/>
-                <w:sz w:val="22"/>
-                <w:szCs w:val="22"/>
-              </w:rPr>
-              <w:t>hrs</w:t>
-            </w:r>
-            <w:proofErr w:type="spellEnd"/>
+              <w:t>9 hrs</w:t>
+            </w:r>
           </w:p>
         </w:tc>
         <w:tc>
@@ -4056,18 +3928,8 @@
                 <w:sz w:val="22"/>
                 <w:szCs w:val="22"/>
               </w:rPr>
-              <w:t xml:space="preserve">3 </w:t>
-            </w:r>
-            <w:proofErr w:type="spellStart"/>
-            <w:r>
-              <w:rPr>
-                <w:rFonts w:ascii="Arial" w:hAnsi="Arial" w:cs="Arial"/>
-                <w:sz w:val="22"/>
-                <w:szCs w:val="22"/>
-              </w:rPr>
-              <w:t>hrs</w:t>
-            </w:r>
-            <w:proofErr w:type="spellEnd"/>
+              <w:t>3 hrs</w:t>
+            </w:r>
           </w:p>
         </w:tc>
         <w:tc>
@@ -4220,18 +4082,8 @@
                 <w:sz w:val="22"/>
                 <w:szCs w:val="22"/>
               </w:rPr>
-              <w:t xml:space="preserve">6 </w:t>
-            </w:r>
-            <w:proofErr w:type="spellStart"/>
-            <w:r>
-              <w:rPr>
-                <w:rFonts w:ascii="Arial" w:hAnsi="Arial" w:cs="Arial"/>
-                <w:sz w:val="22"/>
-                <w:szCs w:val="22"/>
-              </w:rPr>
-              <w:t>hrs</w:t>
-            </w:r>
-            <w:proofErr w:type="spellEnd"/>
+              <w:t>6 hrs</w:t>
+            </w:r>
           </w:p>
         </w:tc>
         <w:tc>
@@ -4362,6 +4214,7 @@
                 <w:sz w:val="22"/>
                 <w:szCs w:val="22"/>
               </w:rPr>
+              <w:lastRenderedPageBreak/>
               <w:t>Database Schema</w:t>
             </w:r>
           </w:p>
@@ -4420,18 +4273,8 @@
                 <w:sz w:val="22"/>
                 <w:szCs w:val="22"/>
               </w:rPr>
-              <w:t xml:space="preserve">6 </w:t>
-            </w:r>
-            <w:proofErr w:type="spellStart"/>
-            <w:r>
-              <w:rPr>
-                <w:rFonts w:ascii="Arial" w:hAnsi="Arial" w:cs="Arial"/>
-                <w:sz w:val="22"/>
-                <w:szCs w:val="22"/>
-              </w:rPr>
-              <w:t>hrs</w:t>
-            </w:r>
-            <w:proofErr w:type="spellEnd"/>
+              <w:t>6 hrs</w:t>
+            </w:r>
           </w:p>
         </w:tc>
         <w:tc>
@@ -4551,18 +4394,8 @@
                 <w:sz w:val="22"/>
                 <w:szCs w:val="22"/>
               </w:rPr>
-              <w:t xml:space="preserve">2 </w:t>
-            </w:r>
-            <w:proofErr w:type="spellStart"/>
-            <w:r>
-              <w:rPr>
-                <w:rFonts w:ascii="Arial" w:hAnsi="Arial" w:cs="Arial"/>
-                <w:sz w:val="22"/>
-                <w:szCs w:val="22"/>
-              </w:rPr>
-              <w:t>hrs</w:t>
-            </w:r>
-            <w:proofErr w:type="spellEnd"/>
+              <w:t>2 hrs</w:t>
+            </w:r>
           </w:p>
         </w:tc>
         <w:tc>
@@ -4680,18 +4513,8 @@
                 <w:sz w:val="22"/>
                 <w:szCs w:val="22"/>
               </w:rPr>
-              <w:t xml:space="preserve">7 </w:t>
-            </w:r>
-            <w:proofErr w:type="spellStart"/>
-            <w:r>
-              <w:rPr>
-                <w:rFonts w:ascii="Arial" w:hAnsi="Arial" w:cs="Arial"/>
-                <w:sz w:val="22"/>
-                <w:szCs w:val="22"/>
-              </w:rPr>
-              <w:t>hrs</w:t>
-            </w:r>
-            <w:proofErr w:type="spellEnd"/>
+              <w:t>7 hrs</w:t>
+            </w:r>
           </w:p>
         </w:tc>
         <w:tc>
@@ -4811,18 +4634,8 @@
                 <w:sz w:val="22"/>
                 <w:szCs w:val="22"/>
               </w:rPr>
-              <w:t xml:space="preserve">4 </w:t>
-            </w:r>
-            <w:proofErr w:type="spellStart"/>
-            <w:r>
-              <w:rPr>
-                <w:rFonts w:ascii="Arial" w:hAnsi="Arial" w:cs="Arial"/>
-                <w:sz w:val="22"/>
-                <w:szCs w:val="22"/>
-              </w:rPr>
-              <w:t>hrs</w:t>
-            </w:r>
-            <w:proofErr w:type="spellEnd"/>
+              <w:t>4 hrs</w:t>
+            </w:r>
           </w:p>
         </w:tc>
         <w:tc>
@@ -4975,18 +4788,8 @@
                 <w:sz w:val="22"/>
                 <w:szCs w:val="22"/>
               </w:rPr>
-              <w:t xml:space="preserve">3 </w:t>
-            </w:r>
-            <w:proofErr w:type="spellStart"/>
-            <w:r>
-              <w:rPr>
-                <w:rFonts w:ascii="Arial" w:hAnsi="Arial" w:cs="Arial"/>
-                <w:sz w:val="22"/>
-                <w:szCs w:val="22"/>
-              </w:rPr>
-              <w:t>hrs</w:t>
-            </w:r>
-            <w:proofErr w:type="spellEnd"/>
+              <w:t>3 hrs</w:t>
+            </w:r>
           </w:p>
         </w:tc>
         <w:tc>
@@ -5106,18 +4909,8 @@
                 <w:sz w:val="22"/>
                 <w:szCs w:val="22"/>
               </w:rPr>
-              <w:t xml:space="preserve">2 </w:t>
-            </w:r>
-            <w:proofErr w:type="spellStart"/>
-            <w:r>
-              <w:rPr>
-                <w:rFonts w:ascii="Arial" w:hAnsi="Arial" w:cs="Arial"/>
-                <w:sz w:val="22"/>
-                <w:szCs w:val="22"/>
-              </w:rPr>
-              <w:t>hrs</w:t>
-            </w:r>
-            <w:proofErr w:type="spellEnd"/>
+              <w:t>2 hrs</w:t>
+            </w:r>
           </w:p>
         </w:tc>
         <w:tc>
@@ -5364,18 +5157,8 @@
                 <w:sz w:val="22"/>
                 <w:szCs w:val="22"/>
               </w:rPr>
-              <w:t xml:space="preserve">2 </w:t>
-            </w:r>
-            <w:proofErr w:type="spellStart"/>
-            <w:r>
-              <w:rPr>
-                <w:rFonts w:ascii="Arial" w:hAnsi="Arial" w:cs="Arial"/>
-                <w:sz w:val="22"/>
-                <w:szCs w:val="22"/>
-              </w:rPr>
-              <w:t>hrs</w:t>
-            </w:r>
-            <w:proofErr w:type="spellEnd"/>
+              <w:t>2 hrs</w:t>
+            </w:r>
           </w:p>
         </w:tc>
         <w:tc>
@@ -5494,18 +5277,8 @@
                 <w:sz w:val="22"/>
                 <w:szCs w:val="22"/>
               </w:rPr>
-              <w:t xml:space="preserve">4 </w:t>
-            </w:r>
-            <w:proofErr w:type="spellStart"/>
-            <w:r>
-              <w:rPr>
-                <w:rFonts w:ascii="Arial" w:hAnsi="Arial" w:cs="Arial"/>
-                <w:sz w:val="22"/>
-                <w:szCs w:val="22"/>
-              </w:rPr>
-              <w:t>hrs</w:t>
-            </w:r>
-            <w:proofErr w:type="spellEnd"/>
+              <w:t>4 hrs</w:t>
+            </w:r>
           </w:p>
         </w:tc>
         <w:tc>
@@ -5752,18 +5525,8 @@
                 <w:sz w:val="22"/>
                 <w:szCs w:val="22"/>
               </w:rPr>
-              <w:t xml:space="preserve">2 </w:t>
-            </w:r>
-            <w:proofErr w:type="spellStart"/>
-            <w:r>
-              <w:rPr>
-                <w:rFonts w:ascii="Arial" w:hAnsi="Arial" w:cs="Arial"/>
-                <w:sz w:val="22"/>
-                <w:szCs w:val="22"/>
-              </w:rPr>
-              <w:t>hrs</w:t>
-            </w:r>
-            <w:proofErr w:type="spellEnd"/>
+              <w:t>2 hrs</w:t>
+            </w:r>
           </w:p>
         </w:tc>
         <w:tc>
@@ -5853,25 +5616,7 @@
                 <w:sz w:val="22"/>
                 <w:szCs w:val="22"/>
               </w:rPr>
-              <w:t xml:space="preserve">Create customer </w:t>
-            </w:r>
-            <w:proofErr w:type="gramStart"/>
-            <w:r>
-              <w:rPr>
-                <w:rFonts w:ascii="Arial" w:hAnsi="Arial" w:cs="Arial"/>
-                <w:sz w:val="22"/>
-                <w:szCs w:val="22"/>
-              </w:rPr>
-              <w:t>record</w:t>
-            </w:r>
-            <w:proofErr w:type="gramEnd"/>
-            <w:r>
-              <w:rPr>
-                <w:rFonts w:ascii="Arial" w:hAnsi="Arial" w:cs="Arial"/>
-                <w:sz w:val="22"/>
-                <w:szCs w:val="22"/>
-              </w:rPr>
-              <w:t>, validate email format, hash password</w:t>
+              <w:t>Create customer record, validate email format, hash password</w:t>
             </w:r>
           </w:p>
         </w:tc>
@@ -5901,18 +5646,8 @@
                 <w:sz w:val="22"/>
                 <w:szCs w:val="22"/>
               </w:rPr>
-              <w:t xml:space="preserve">4 </w:t>
-            </w:r>
-            <w:proofErr w:type="spellStart"/>
-            <w:r>
-              <w:rPr>
-                <w:rFonts w:ascii="Arial" w:hAnsi="Arial" w:cs="Arial"/>
-                <w:sz w:val="22"/>
-                <w:szCs w:val="22"/>
-              </w:rPr>
-              <w:t>hrs</w:t>
-            </w:r>
-            <w:proofErr w:type="spellEnd"/>
+              <w:t>4 hrs</w:t>
+            </w:r>
           </w:p>
         </w:tc>
         <w:tc>
@@ -6005,9 +5740,29 @@
                 <w:sz w:val="22"/>
                 <w:szCs w:val="22"/>
               </w:rPr>
-              <w:t xml:space="preserve">Writes to customers table (new row, unique </w:t>
-            </w:r>
-            <w:proofErr w:type="spellStart"/>
+              <w:t>Writes to customers table (new row, unique CustomerID, hashed password)</w:t>
+            </w:r>
+          </w:p>
+        </w:tc>
+        <w:tc>
+          <w:tcPr>
+            <w:tcW w:w="1980" w:type="dxa"/>
+            <w:tcMar>
+              <w:top w:w="80" w:type="dxa"/>
+              <w:left w:w="100" w:type="dxa"/>
+              <w:bottom w:w="80" w:type="dxa"/>
+              <w:right w:w="100" w:type="dxa"/>
+            </w:tcMar>
+          </w:tcPr>
+          <w:p>
+            <w:pPr>
+              <w:spacing w:before="60" w:after="60"/>
+              <w:rPr>
+                <w:rFonts w:ascii="Arial" w:hAnsi="Arial" w:cs="Arial"/>
+                <w:sz w:val="22"/>
+                <w:szCs w:val="22"/>
+              </w:rPr>
+            </w:pPr>
             <w:r>
               <w:rPr>
                 <w:rFonts w:ascii="Arial" w:hAnsi="Arial" w:cs="Arial"/>
@@ -6016,9 +5771,29 @@
                 <w:sz w:val="22"/>
                 <w:szCs w:val="22"/>
               </w:rPr>
-              <w:t>CustomerID</w:t>
-            </w:r>
-            <w:proofErr w:type="spellEnd"/>
+              <w:t>-</w:t>
+            </w:r>
+          </w:p>
+        </w:tc>
+        <w:tc>
+          <w:tcPr>
+            <w:tcW w:w="1565" w:type="dxa"/>
+            <w:tcMar>
+              <w:top w:w="80" w:type="dxa"/>
+              <w:left w:w="100" w:type="dxa"/>
+              <w:bottom w:w="80" w:type="dxa"/>
+              <w:right w:w="100" w:type="dxa"/>
+            </w:tcMar>
+          </w:tcPr>
+          <w:p>
+            <w:pPr>
+              <w:spacing w:before="60" w:after="60"/>
+              <w:rPr>
+                <w:rFonts w:ascii="Arial" w:hAnsi="Arial" w:cs="Arial"/>
+                <w:sz w:val="22"/>
+                <w:szCs w:val="22"/>
+              </w:rPr>
+            </w:pPr>
             <w:r>
               <w:rPr>
                 <w:rFonts w:ascii="Arial" w:hAnsi="Arial" w:cs="Arial"/>
@@ -6027,68 +5802,6 @@
                 <w:sz w:val="22"/>
                 <w:szCs w:val="22"/>
               </w:rPr>
-              <w:t>, hashed password)</w:t>
-            </w:r>
-          </w:p>
-        </w:tc>
-        <w:tc>
-          <w:tcPr>
-            <w:tcW w:w="1980" w:type="dxa"/>
-            <w:tcMar>
-              <w:top w:w="80" w:type="dxa"/>
-              <w:left w:w="100" w:type="dxa"/>
-              <w:bottom w:w="80" w:type="dxa"/>
-              <w:right w:w="100" w:type="dxa"/>
-            </w:tcMar>
-          </w:tcPr>
-          <w:p>
-            <w:pPr>
-              <w:spacing w:before="60" w:after="60"/>
-              <w:rPr>
-                <w:rFonts w:ascii="Arial" w:hAnsi="Arial" w:cs="Arial"/>
-                <w:sz w:val="22"/>
-                <w:szCs w:val="22"/>
-              </w:rPr>
-            </w:pPr>
-            <w:r>
-              <w:rPr>
-                <w:rFonts w:ascii="Arial" w:hAnsi="Arial" w:cs="Arial"/>
-                <w:i/>
-                <w:iCs/>
-                <w:sz w:val="22"/>
-                <w:szCs w:val="22"/>
-              </w:rPr>
-              <w:t>-</w:t>
-            </w:r>
-          </w:p>
-        </w:tc>
-        <w:tc>
-          <w:tcPr>
-            <w:tcW w:w="1565" w:type="dxa"/>
-            <w:tcMar>
-              <w:top w:w="80" w:type="dxa"/>
-              <w:left w:w="100" w:type="dxa"/>
-              <w:bottom w:w="80" w:type="dxa"/>
-              <w:right w:w="100" w:type="dxa"/>
-            </w:tcMar>
-          </w:tcPr>
-          <w:p>
-            <w:pPr>
-              <w:spacing w:before="60" w:after="60"/>
-              <w:rPr>
-                <w:rFonts w:ascii="Arial" w:hAnsi="Arial" w:cs="Arial"/>
-                <w:sz w:val="22"/>
-                <w:szCs w:val="22"/>
-              </w:rPr>
-            </w:pPr>
-            <w:r>
-              <w:rPr>
-                <w:rFonts w:ascii="Arial" w:hAnsi="Arial" w:cs="Arial"/>
-                <w:i/>
-                <w:iCs/>
-                <w:sz w:val="22"/>
-                <w:szCs w:val="22"/>
-              </w:rPr>
               <w:t>Sep 6</w:t>
             </w:r>
           </w:p>
@@ -6181,18 +5894,8 @@
                 <w:sz w:val="22"/>
                 <w:szCs w:val="22"/>
               </w:rPr>
-              <w:t xml:space="preserve">3 </w:t>
-            </w:r>
-            <w:proofErr w:type="spellStart"/>
-            <w:r>
-              <w:rPr>
-                <w:rFonts w:ascii="Arial" w:hAnsi="Arial" w:cs="Arial"/>
-                <w:sz w:val="22"/>
-                <w:szCs w:val="22"/>
-              </w:rPr>
-              <w:t>hrs</w:t>
-            </w:r>
-            <w:proofErr w:type="spellEnd"/>
+              <w:t>3 hrs</w:t>
+            </w:r>
           </w:p>
         </w:tc>
         <w:tc>
@@ -6345,18 +6048,8 @@
                 <w:sz w:val="22"/>
                 <w:szCs w:val="22"/>
               </w:rPr>
-              <w:t xml:space="preserve">3 </w:t>
-            </w:r>
-            <w:proofErr w:type="spellStart"/>
-            <w:r>
-              <w:rPr>
-                <w:rFonts w:ascii="Arial" w:hAnsi="Arial" w:cs="Arial"/>
-                <w:sz w:val="22"/>
-                <w:szCs w:val="22"/>
-              </w:rPr>
-              <w:t>hrs</w:t>
-            </w:r>
-            <w:proofErr w:type="spellEnd"/>
+              <w:t>3 hrs</w:t>
+            </w:r>
           </w:p>
         </w:tc>
         <w:tc>
@@ -6476,18 +6169,8 @@
                 <w:sz w:val="22"/>
                 <w:szCs w:val="22"/>
               </w:rPr>
-              <w:t xml:space="preserve">5 </w:t>
-            </w:r>
-            <w:proofErr w:type="spellStart"/>
-            <w:r>
-              <w:rPr>
-                <w:rFonts w:ascii="Arial" w:hAnsi="Arial" w:cs="Arial"/>
-                <w:sz w:val="22"/>
-                <w:szCs w:val="22"/>
-              </w:rPr>
-              <w:t>hrs</w:t>
-            </w:r>
-            <w:proofErr w:type="spellEnd"/>
+              <w:t>5 hrs</w:t>
+            </w:r>
           </w:p>
         </w:tc>
         <w:tc>
@@ -6735,18 +6418,8 @@
                 <w:sz w:val="22"/>
                 <w:szCs w:val="22"/>
               </w:rPr>
-              <w:t xml:space="preserve">2 </w:t>
-            </w:r>
-            <w:proofErr w:type="spellStart"/>
-            <w:r>
-              <w:rPr>
-                <w:rFonts w:ascii="Arial" w:hAnsi="Arial" w:cs="Arial"/>
-                <w:sz w:val="22"/>
-                <w:szCs w:val="22"/>
-              </w:rPr>
-              <w:t>hrs</w:t>
-            </w:r>
-            <w:proofErr w:type="spellEnd"/>
+              <w:t>2 hrs</w:t>
+            </w:r>
           </w:p>
         </w:tc>
         <w:tc>
@@ -6864,18 +6537,8 @@
                 <w:sz w:val="22"/>
                 <w:szCs w:val="22"/>
               </w:rPr>
-              <w:t xml:space="preserve">1 </w:t>
-            </w:r>
-            <w:proofErr w:type="spellStart"/>
-            <w:r>
-              <w:rPr>
-                <w:rFonts w:ascii="Arial" w:hAnsi="Arial" w:cs="Arial"/>
-                <w:sz w:val="22"/>
-                <w:szCs w:val="22"/>
-              </w:rPr>
-              <w:t>hr</w:t>
-            </w:r>
-            <w:proofErr w:type="spellEnd"/>
+              <w:t>1 hr</w:t>
+            </w:r>
           </w:p>
         </w:tc>
         <w:tc>
@@ -7122,18 +6785,8 @@
                 <w:sz w:val="22"/>
                 <w:szCs w:val="22"/>
               </w:rPr>
-              <w:t xml:space="preserve">2 </w:t>
-            </w:r>
-            <w:proofErr w:type="spellStart"/>
-            <w:r>
-              <w:rPr>
-                <w:rFonts w:ascii="Arial" w:hAnsi="Arial" w:cs="Arial"/>
-                <w:sz w:val="22"/>
-                <w:szCs w:val="22"/>
-              </w:rPr>
-              <w:t>hrs</w:t>
-            </w:r>
-            <w:proofErr w:type="spellEnd"/>
+              <w:t>2 hrs</w:t>
+            </w:r>
           </w:p>
         </w:tc>
         <w:tc>
@@ -7253,18 +6906,8 @@
                 <w:sz w:val="22"/>
                 <w:szCs w:val="22"/>
               </w:rPr>
-              <w:t xml:space="preserve">3 </w:t>
-            </w:r>
-            <w:proofErr w:type="spellStart"/>
-            <w:r>
-              <w:rPr>
-                <w:rFonts w:ascii="Arial" w:hAnsi="Arial" w:cs="Arial"/>
-                <w:sz w:val="22"/>
-                <w:szCs w:val="22"/>
-              </w:rPr>
-              <w:t>hrs</w:t>
-            </w:r>
-            <w:proofErr w:type="spellEnd"/>
+              <w:t>3 hrs</w:t>
+            </w:r>
           </w:p>
         </w:tc>
         <w:tc>
@@ -7511,18 +7154,8 @@
                 <w:sz w:val="22"/>
                 <w:szCs w:val="22"/>
               </w:rPr>
-              <w:t xml:space="preserve">2 </w:t>
-            </w:r>
-            <w:proofErr w:type="spellStart"/>
-            <w:r>
-              <w:rPr>
-                <w:rFonts w:ascii="Arial" w:hAnsi="Arial" w:cs="Arial"/>
-                <w:sz w:val="22"/>
-                <w:szCs w:val="22"/>
-              </w:rPr>
-              <w:t>hrs</w:t>
-            </w:r>
-            <w:proofErr w:type="spellEnd"/>
+              <w:t>2 hrs</w:t>
+            </w:r>
           </w:p>
         </w:tc>
         <w:tc>
@@ -7640,25 +7273,7 @@
                 <w:sz w:val="22"/>
                 <w:szCs w:val="22"/>
               </w:rPr>
-              <w:t xml:space="preserve">1 </w:t>
-            </w:r>
-            <w:proofErr w:type="spellStart"/>
-            <w:r>
-              <w:rPr>
-                <w:rFonts w:ascii="Arial" w:hAnsi="Arial" w:cs="Arial"/>
-                <w:sz w:val="22"/>
-                <w:szCs w:val="22"/>
-              </w:rPr>
-              <w:t>hr</w:t>
-            </w:r>
-            <w:proofErr w:type="spellEnd"/>
-            <w:r>
-              <w:rPr>
-                <w:rFonts w:ascii="Arial" w:hAnsi="Arial" w:cs="Arial"/>
-                <w:sz w:val="22"/>
-                <w:szCs w:val="22"/>
-              </w:rPr>
-              <w:t>/person</w:t>
+              <w:t>1 hr/person</w:t>
             </w:r>
           </w:p>
         </w:tc>
@@ -7823,18 +7438,8 @@
                 <w:sz w:val="22"/>
                 <w:szCs w:val="22"/>
               </w:rPr>
-              <w:t xml:space="preserve">2 </w:t>
-            </w:r>
-            <w:proofErr w:type="spellStart"/>
-            <w:r>
-              <w:rPr>
-                <w:rFonts w:ascii="Arial" w:hAnsi="Arial" w:cs="Arial"/>
-                <w:sz w:val="22"/>
-                <w:szCs w:val="22"/>
-              </w:rPr>
-              <w:t>hrs</w:t>
-            </w:r>
-            <w:proofErr w:type="spellEnd"/>
+              <w:t>2 hrs</w:t>
+            </w:r>
           </w:p>
         </w:tc>
         <w:tc>
@@ -7955,18 +7560,8 @@
                 <w:sz w:val="22"/>
                 <w:szCs w:val="22"/>
               </w:rPr>
-              <w:t xml:space="preserve">1 </w:t>
-            </w:r>
-            <w:proofErr w:type="spellStart"/>
-            <w:r>
-              <w:rPr>
-                <w:rFonts w:ascii="Arial" w:hAnsi="Arial" w:cs="Arial"/>
-                <w:sz w:val="22"/>
-                <w:szCs w:val="22"/>
-              </w:rPr>
-              <w:t>hr</w:t>
-            </w:r>
-            <w:proofErr w:type="spellEnd"/>
+              <w:t>1 hr</w:t>
+            </w:r>
           </w:p>
         </w:tc>
         <w:tc>
@@ -8213,18 +7808,8 @@
                 <w:sz w:val="22"/>
                 <w:szCs w:val="22"/>
               </w:rPr>
-              <w:t xml:space="preserve">2 </w:t>
-            </w:r>
-            <w:proofErr w:type="spellStart"/>
-            <w:r>
-              <w:rPr>
-                <w:rFonts w:ascii="Arial" w:hAnsi="Arial" w:cs="Arial"/>
-                <w:sz w:val="22"/>
-                <w:szCs w:val="22"/>
-              </w:rPr>
-              <w:t>hrs</w:t>
-            </w:r>
-            <w:proofErr w:type="spellEnd"/>
+              <w:t>2 hrs</w:t>
+            </w:r>
           </w:p>
         </w:tc>
         <w:tc>
@@ -8342,18 +7927,8 @@
                 <w:sz w:val="22"/>
                 <w:szCs w:val="22"/>
               </w:rPr>
-              <w:t xml:space="preserve">3 </w:t>
-            </w:r>
-            <w:proofErr w:type="spellStart"/>
-            <w:r>
-              <w:rPr>
-                <w:rFonts w:ascii="Arial" w:hAnsi="Arial" w:cs="Arial"/>
-                <w:sz w:val="22"/>
-                <w:szCs w:val="22"/>
-              </w:rPr>
-              <w:t>hrs</w:t>
-            </w:r>
-            <w:proofErr w:type="spellEnd"/>
+              <w:t>3 hrs</w:t>
+            </w:r>
           </w:p>
         </w:tc>
         <w:tc>
@@ -8600,18 +8175,8 @@
                 <w:sz w:val="22"/>
                 <w:szCs w:val="22"/>
               </w:rPr>
-              <w:t xml:space="preserve">2 </w:t>
-            </w:r>
-            <w:proofErr w:type="spellStart"/>
-            <w:r>
-              <w:rPr>
-                <w:rFonts w:ascii="Arial" w:hAnsi="Arial" w:cs="Arial"/>
-                <w:sz w:val="22"/>
-                <w:szCs w:val="22"/>
-              </w:rPr>
-              <w:t>hrs</w:t>
-            </w:r>
-            <w:proofErr w:type="spellEnd"/>
+              <w:t>2 hrs</w:t>
+            </w:r>
           </w:p>
         </w:tc>
         <w:tc>
@@ -8731,25 +8296,7 @@
                 <w:sz w:val="22"/>
                 <w:szCs w:val="22"/>
               </w:rPr>
-              <w:t xml:space="preserve">1 </w:t>
-            </w:r>
-            <w:proofErr w:type="spellStart"/>
-            <w:r>
-              <w:rPr>
-                <w:rFonts w:ascii="Arial" w:hAnsi="Arial" w:cs="Arial"/>
-                <w:sz w:val="22"/>
-                <w:szCs w:val="22"/>
-              </w:rPr>
-              <w:t>hr</w:t>
-            </w:r>
-            <w:proofErr w:type="spellEnd"/>
-            <w:r>
-              <w:rPr>
-                <w:rFonts w:ascii="Arial" w:hAnsi="Arial" w:cs="Arial"/>
-                <w:sz w:val="22"/>
-                <w:szCs w:val="22"/>
-              </w:rPr>
-              <w:t>/person</w:t>
+              <w:t>1 hr/person</w:t>
             </w:r>
           </w:p>
         </w:tc>
@@ -8903,18 +8450,8 @@
                 <w:sz w:val="22"/>
                 <w:szCs w:val="22"/>
               </w:rPr>
-              <w:t xml:space="preserve">2 </w:t>
-            </w:r>
-            <w:proofErr w:type="spellStart"/>
-            <w:r>
-              <w:rPr>
-                <w:rFonts w:ascii="Arial" w:hAnsi="Arial" w:cs="Arial"/>
-                <w:sz w:val="22"/>
-                <w:szCs w:val="22"/>
-              </w:rPr>
-              <w:t>hrs</w:t>
-            </w:r>
-            <w:proofErr w:type="spellEnd"/>
+              <w:t>2 hrs</w:t>
+            </w:r>
           </w:p>
         </w:tc>
         <w:tc>
@@ -9034,18 +8571,8 @@
                 <w:sz w:val="22"/>
                 <w:szCs w:val="22"/>
               </w:rPr>
-              <w:t xml:space="preserve">4 </w:t>
-            </w:r>
-            <w:proofErr w:type="spellStart"/>
-            <w:r>
-              <w:rPr>
-                <w:rFonts w:ascii="Arial" w:hAnsi="Arial" w:cs="Arial"/>
-                <w:sz w:val="22"/>
-                <w:szCs w:val="22"/>
-              </w:rPr>
-              <w:t>hrs</w:t>
-            </w:r>
-            <w:proofErr w:type="spellEnd"/>
+              <w:t>4 hrs</w:t>
+            </w:r>
           </w:p>
         </w:tc>
         <w:tc>
@@ -9139,9 +8666,29 @@
                 <w:sz w:val="22"/>
                 <w:szCs w:val="22"/>
               </w:rPr>
-              <w:t xml:space="preserve">Reads/writes </w:t>
-            </w:r>
-            <w:proofErr w:type="spellStart"/>
+              <w:t>Reads/writes wait_list, reads slips</w:t>
+            </w:r>
+          </w:p>
+        </w:tc>
+        <w:tc>
+          <w:tcPr>
+            <w:tcW w:w="1980" w:type="dxa"/>
+            <w:tcMar>
+              <w:top w:w="80" w:type="dxa"/>
+              <w:left w:w="100" w:type="dxa"/>
+              <w:bottom w:w="80" w:type="dxa"/>
+              <w:right w:w="100" w:type="dxa"/>
+            </w:tcMar>
+          </w:tcPr>
+          <w:p>
+            <w:pPr>
+              <w:spacing w:before="60" w:after="60"/>
+              <w:rPr>
+                <w:rFonts w:ascii="Arial" w:hAnsi="Arial" w:cs="Arial"/>
+                <w:sz w:val="22"/>
+                <w:szCs w:val="22"/>
+              </w:rPr>
+            </w:pPr>
             <w:r>
               <w:rPr>
                 <w:rFonts w:ascii="Arial" w:hAnsi="Arial" w:cs="Arial"/>
@@ -9150,9 +8697,29 @@
                 <w:sz w:val="22"/>
                 <w:szCs w:val="22"/>
               </w:rPr>
-              <w:t>wait_list</w:t>
-            </w:r>
-            <w:proofErr w:type="spellEnd"/>
+              <w:t>-</w:t>
+            </w:r>
+          </w:p>
+        </w:tc>
+        <w:tc>
+          <w:tcPr>
+            <w:tcW w:w="1565" w:type="dxa"/>
+            <w:tcMar>
+              <w:top w:w="80" w:type="dxa"/>
+              <w:left w:w="100" w:type="dxa"/>
+              <w:bottom w:w="80" w:type="dxa"/>
+              <w:right w:w="100" w:type="dxa"/>
+            </w:tcMar>
+          </w:tcPr>
+          <w:p>
+            <w:pPr>
+              <w:spacing w:before="60" w:after="60"/>
+              <w:rPr>
+                <w:rFonts w:ascii="Arial" w:hAnsi="Arial" w:cs="Arial"/>
+                <w:sz w:val="22"/>
+                <w:szCs w:val="22"/>
+              </w:rPr>
+            </w:pPr>
             <w:r>
               <w:rPr>
                 <w:rFonts w:ascii="Arial" w:hAnsi="Arial" w:cs="Arial"/>
@@ -9161,68 +8728,6 @@
                 <w:sz w:val="22"/>
                 <w:szCs w:val="22"/>
               </w:rPr>
-              <w:t>, reads slips</w:t>
-            </w:r>
-          </w:p>
-        </w:tc>
-        <w:tc>
-          <w:tcPr>
-            <w:tcW w:w="1980" w:type="dxa"/>
-            <w:tcMar>
-              <w:top w:w="80" w:type="dxa"/>
-              <w:left w:w="100" w:type="dxa"/>
-              <w:bottom w:w="80" w:type="dxa"/>
-              <w:right w:w="100" w:type="dxa"/>
-            </w:tcMar>
-          </w:tcPr>
-          <w:p>
-            <w:pPr>
-              <w:spacing w:before="60" w:after="60"/>
-              <w:rPr>
-                <w:rFonts w:ascii="Arial" w:hAnsi="Arial" w:cs="Arial"/>
-                <w:sz w:val="22"/>
-                <w:szCs w:val="22"/>
-              </w:rPr>
-            </w:pPr>
-            <w:r>
-              <w:rPr>
-                <w:rFonts w:ascii="Arial" w:hAnsi="Arial" w:cs="Arial"/>
-                <w:i/>
-                <w:iCs/>
-                <w:sz w:val="22"/>
-                <w:szCs w:val="22"/>
-              </w:rPr>
-              <w:t>-</w:t>
-            </w:r>
-          </w:p>
-        </w:tc>
-        <w:tc>
-          <w:tcPr>
-            <w:tcW w:w="1565" w:type="dxa"/>
-            <w:tcMar>
-              <w:top w:w="80" w:type="dxa"/>
-              <w:left w:w="100" w:type="dxa"/>
-              <w:bottom w:w="80" w:type="dxa"/>
-              <w:right w:w="100" w:type="dxa"/>
-            </w:tcMar>
-          </w:tcPr>
-          <w:p>
-            <w:pPr>
-              <w:spacing w:before="60" w:after="60"/>
-              <w:rPr>
-                <w:rFonts w:ascii="Arial" w:hAnsi="Arial" w:cs="Arial"/>
-                <w:sz w:val="22"/>
-                <w:szCs w:val="22"/>
-              </w:rPr>
-            </w:pPr>
-            <w:r>
-              <w:rPr>
-                <w:rFonts w:ascii="Arial" w:hAnsi="Arial" w:cs="Arial"/>
-                <w:i/>
-                <w:iCs/>
-                <w:sz w:val="22"/>
-                <w:szCs w:val="22"/>
-              </w:rPr>
               <w:t>Sep 27</w:t>
             </w:r>
           </w:p>
@@ -9315,18 +8820,8 @@
                 <w:sz w:val="22"/>
                 <w:szCs w:val="22"/>
               </w:rPr>
-              <w:t xml:space="preserve">1 </w:t>
-            </w:r>
-            <w:proofErr w:type="spellStart"/>
-            <w:r>
-              <w:rPr>
-                <w:rFonts w:ascii="Arial" w:hAnsi="Arial" w:cs="Arial"/>
-                <w:sz w:val="22"/>
-                <w:szCs w:val="22"/>
-              </w:rPr>
-              <w:t>hr</w:t>
-            </w:r>
-            <w:proofErr w:type="spellEnd"/>
+              <w:t>1 hr</w:t>
+            </w:r>
           </w:p>
         </w:tc>
         <w:tc>
@@ -9479,18 +8974,8 @@
                 <w:sz w:val="22"/>
                 <w:szCs w:val="22"/>
               </w:rPr>
-              <w:t xml:space="preserve">4 </w:t>
-            </w:r>
-            <w:proofErr w:type="spellStart"/>
-            <w:r>
-              <w:rPr>
-                <w:rFonts w:ascii="Arial" w:hAnsi="Arial" w:cs="Arial"/>
-                <w:sz w:val="22"/>
-                <w:szCs w:val="22"/>
-              </w:rPr>
-              <w:t>hrs</w:t>
-            </w:r>
-            <w:proofErr w:type="spellEnd"/>
+              <w:t>4 hrs</w:t>
+            </w:r>
           </w:p>
         </w:tc>
         <w:tc>
@@ -9610,18 +9095,8 @@
                 <w:sz w:val="22"/>
                 <w:szCs w:val="22"/>
               </w:rPr>
-              <w:t xml:space="preserve">3 </w:t>
-            </w:r>
-            <w:proofErr w:type="spellStart"/>
-            <w:r>
-              <w:rPr>
-                <w:rFonts w:ascii="Arial" w:hAnsi="Arial" w:cs="Arial"/>
-                <w:sz w:val="22"/>
-                <w:szCs w:val="22"/>
-              </w:rPr>
-              <w:t>hrs</w:t>
-            </w:r>
-            <w:proofErr w:type="spellEnd"/>
+              <w:t>3 hrs</w:t>
+            </w:r>
           </w:p>
         </w:tc>
         <w:tc>
@@ -9774,25 +9249,7 @@
                 <w:sz w:val="22"/>
                 <w:szCs w:val="22"/>
               </w:rPr>
-              <w:t xml:space="preserve">2 </w:t>
-            </w:r>
-            <w:proofErr w:type="spellStart"/>
-            <w:r>
-              <w:rPr>
-                <w:rFonts w:ascii="Arial" w:hAnsi="Arial" w:cs="Arial"/>
-                <w:sz w:val="22"/>
-                <w:szCs w:val="22"/>
-              </w:rPr>
-              <w:t>hrs</w:t>
-            </w:r>
-            <w:proofErr w:type="spellEnd"/>
-            <w:r>
-              <w:rPr>
-                <w:rFonts w:ascii="Arial" w:hAnsi="Arial" w:cs="Arial"/>
-                <w:sz w:val="22"/>
-                <w:szCs w:val="22"/>
-              </w:rPr>
-              <w:t>/person</w:t>
+              <w:t>2 hrs/person</w:t>
             </w:r>
           </w:p>
         </w:tc>
@@ -9913,18 +9370,8 @@
                 <w:sz w:val="22"/>
                 <w:szCs w:val="22"/>
               </w:rPr>
-              <w:t xml:space="preserve">5-8 </w:t>
-            </w:r>
-            <w:proofErr w:type="spellStart"/>
-            <w:r>
-              <w:rPr>
-                <w:rFonts w:ascii="Arial" w:hAnsi="Arial" w:cs="Arial"/>
-                <w:sz w:val="22"/>
-                <w:szCs w:val="22"/>
-              </w:rPr>
-              <w:t>hrs</w:t>
-            </w:r>
-            <w:proofErr w:type="spellEnd"/>
+              <w:t>5-8 hrs</w:t>
+            </w:r>
           </w:p>
         </w:tc>
         <w:tc>
@@ -10042,18 +9489,8 @@
                 <w:sz w:val="22"/>
                 <w:szCs w:val="22"/>
               </w:rPr>
-              <w:t xml:space="preserve">2 </w:t>
-            </w:r>
-            <w:proofErr w:type="spellStart"/>
-            <w:r>
-              <w:rPr>
-                <w:rFonts w:ascii="Arial" w:hAnsi="Arial" w:cs="Arial"/>
-                <w:sz w:val="22"/>
-                <w:szCs w:val="22"/>
-              </w:rPr>
-              <w:t>hrs</w:t>
-            </w:r>
-            <w:proofErr w:type="spellEnd"/>
+              <w:t>2 hrs</w:t>
+            </w:r>
           </w:p>
         </w:tc>
         <w:tc>
@@ -10173,18 +9610,8 @@
                 <w:sz w:val="22"/>
                 <w:szCs w:val="22"/>
               </w:rPr>
-              <w:t xml:space="preserve">1 </w:t>
-            </w:r>
-            <w:proofErr w:type="spellStart"/>
-            <w:r>
-              <w:rPr>
-                <w:rFonts w:ascii="Arial" w:hAnsi="Arial" w:cs="Arial"/>
-                <w:sz w:val="22"/>
-                <w:szCs w:val="22"/>
-              </w:rPr>
-              <w:t>hr</w:t>
-            </w:r>
-            <w:proofErr w:type="spellEnd"/>
+              <w:t>1 hr</w:t>
+            </w:r>
           </w:p>
         </w:tc>
         <w:tc>
@@ -10282,25 +9709,7 @@
           <w:sz w:val="22"/>
           <w:szCs w:val="22"/>
         </w:rPr>
-        <w:t xml:space="preserve">We started with two numbers we found while researching typical web project timelines: about 40 hours for planning and design, and roughly 5 hours to build each page. For the login page, we used a starting point of 1 to 3 hours for a basic username and password check. From there, we adjusted each task up or down by hand. A page like Slip Reservation, which </w:t>
-      </w:r>
-      <w:proofErr w:type="gramStart"/>
-      <w:r>
-        <w:rPr>
-          <w:rFonts w:ascii="Arial" w:hAnsi="Arial" w:cs="Arial"/>
-          <w:sz w:val="22"/>
-          <w:szCs w:val="22"/>
-        </w:rPr>
-        <w:t>has to</w:t>
-      </w:r>
-      <w:proofErr w:type="gramEnd"/>
-      <w:r>
-        <w:rPr>
-          <w:rFonts w:ascii="Arial" w:hAnsi="Arial" w:cs="Arial"/>
-          <w:sz w:val="22"/>
-          <w:szCs w:val="22"/>
-        </w:rPr>
-        <w:t xml:space="preserve"> match a boat's length to an </w:t>
+        <w:t xml:space="preserve">We started with two numbers we found while researching typical web project timelines: about 40 hours for planning and design, and roughly 5 hours to build each page. For the login page, we used a starting point of 1 to 3 hours for a basic username and password check. From there, we adjusted each task up or down by hand. A page like Slip Reservation, which has to match a boat's length to an </w:t>
       </w:r>
       <w:r>
         <w:rPr>
@@ -10316,43 +9725,7 @@
           <w:sz w:val="22"/>
           <w:szCs w:val="22"/>
         </w:rPr>
-        <w:t xml:space="preserve"> slip, took more time than something like the About Us page. It's worth knowing that </w:t>
-      </w:r>
-      <w:proofErr w:type="gramStart"/>
-      <w:r>
-        <w:rPr>
-          <w:rFonts w:ascii="Arial" w:hAnsi="Arial" w:cs="Arial"/>
-          <w:sz w:val="22"/>
-          <w:szCs w:val="22"/>
-        </w:rPr>
-        <w:t>both of these</w:t>
-      </w:r>
-      <w:proofErr w:type="gramEnd"/>
-      <w:r>
-        <w:rPr>
-          <w:rFonts w:ascii="Arial" w:hAnsi="Arial" w:cs="Arial"/>
-          <w:sz w:val="22"/>
-          <w:szCs w:val="22"/>
-        </w:rPr>
-        <w:t xml:space="preserve"> numbers came from articles written to help price out client projects, not from a formal study of how long development </w:t>
-      </w:r>
-      <w:proofErr w:type="gramStart"/>
-      <w:r>
-        <w:rPr>
-          <w:rFonts w:ascii="Arial" w:hAnsi="Arial" w:cs="Arial"/>
-          <w:sz w:val="22"/>
-          <w:szCs w:val="22"/>
-        </w:rPr>
-        <w:t>actually takes</w:t>
-      </w:r>
-      <w:proofErr w:type="gramEnd"/>
-      <w:r>
-        <w:rPr>
-          <w:rFonts w:ascii="Arial" w:hAnsi="Arial" w:cs="Arial"/>
-          <w:sz w:val="22"/>
-          <w:szCs w:val="22"/>
-        </w:rPr>
-        <w:t>. So</w:t>
+        <w:t xml:space="preserve"> slip, took more time than something like the About Us page. It's worth knowing that both of these numbers came from articles written to help price out client projects, not from a formal study of how long development actually takes. So</w:t>
       </w:r>
       <w:r>
         <w:rPr>
@@ -10516,18 +9889,8 @@
           <w:sz w:val="22"/>
           <w:szCs w:val="22"/>
         </w:rPr>
-        <w:t>directory/</w:t>
+        <w:t>directory/index.php#prettyPhoto</w:t>
       </w:r>
-      <w:proofErr w:type="spellStart"/>
-      <w:r>
-        <w:rPr>
-          <w:rFonts w:ascii="Arial" w:hAnsi="Arial" w:cs="Arial"/>
-          <w:sz w:val="22"/>
-          <w:szCs w:val="22"/>
-        </w:rPr>
-        <w:t>index.php#prettyPhoto</w:t>
-      </w:r>
-      <w:proofErr w:type="spellEnd"/>
     </w:p>
     <w:p>
       <w:pPr>
@@ -10623,23 +9986,13 @@
           <w:szCs w:val="22"/>
         </w:rPr>
       </w:pPr>
-      <w:proofErr w:type="spellStart"/>
       <w:r>
         <w:rPr>
           <w:rFonts w:ascii="Arial" w:hAnsi="Arial" w:cs="Arial"/>
           <w:sz w:val="22"/>
           <w:szCs w:val="22"/>
         </w:rPr>
-        <w:t>Givnish</w:t>
-      </w:r>
-      <w:proofErr w:type="spellEnd"/>
-      <w:r>
-        <w:rPr>
-          <w:rFonts w:ascii="Arial" w:hAnsi="Arial" w:cs="Arial"/>
-          <w:sz w:val="22"/>
-          <w:szCs w:val="22"/>
-        </w:rPr>
-        <w:t>, C. (2015, July 21). User-centered design: User personas vs. user stories. Function1.</w:t>
+        <w:t>Givnish, C. (2015, July 21). User-centered design: User personas vs. user stories. Function1.</w:t>
       </w:r>
       <w:r>
         <w:rPr>
@@ -10722,18 +10075,8 @@
           <w:sz w:val="22"/>
           <w:szCs w:val="22"/>
         </w:rPr>
-        <w:t xml:space="preserve">Martin, M. (2025, February 12). How much does it cost to develop a website? </w:t>
+        <w:t>Martin, M. (2025, February 12). How much does it cost to develop a website? DesignRush</w:t>
       </w:r>
-      <w:proofErr w:type="spellStart"/>
-      <w:r>
-        <w:rPr>
-          <w:rFonts w:ascii="Arial" w:hAnsi="Arial" w:cs="Arial"/>
-          <w:sz w:val="22"/>
-          <w:szCs w:val="22"/>
-        </w:rPr>
-        <w:t>DesignRush</w:t>
-      </w:r>
-      <w:proofErr w:type="spellEnd"/>
       <w:r>
         <w:rPr>
           <w:rFonts w:ascii="Arial" w:hAnsi="Arial" w:cs="Arial"/>
@@ -10900,25 +10243,7 @@
           <w:sz w:val="22"/>
           <w:szCs w:val="22"/>
         </w:rPr>
-        <w:t xml:space="preserve">MDN contributors. (2025c, December 22). HTML: </w:t>
-      </w:r>
-      <w:proofErr w:type="spellStart"/>
-      <w:r>
-        <w:rPr>
-          <w:rFonts w:ascii="Arial" w:hAnsi="Arial" w:cs="Arial"/>
-          <w:sz w:val="22"/>
-          <w:szCs w:val="22"/>
-        </w:rPr>
-        <w:t>HyperText</w:t>
-      </w:r>
-      <w:proofErr w:type="spellEnd"/>
-      <w:r>
-        <w:rPr>
-          <w:rFonts w:ascii="Arial" w:hAnsi="Arial" w:cs="Arial"/>
-          <w:sz w:val="22"/>
-          <w:szCs w:val="22"/>
-        </w:rPr>
-        <w:t xml:space="preserve"> Markup Language. MDN Web </w:t>
+        <w:t xml:space="preserve">MDN contributors. (2025c, December 22). HTML: HyperText Markup Language. MDN Web </w:t>
       </w:r>
     </w:p>
     <w:p>

</xml_diff>